<commit_message>
Compute estimate: adopt the upper plan
- Plan of record: 64 screening variants for the 3D model, 3,000 sampler
  steps, DFT at its upper end, the 2D work left included, and a 20%
  margin on GPU and on non-DFT CPU work.
- Totals: 653 GPU-h (35.3K credits), 6,861 core-h (~6.9K credits),
  1 TB storage (10K credits): about 52K credits, 26% of a 200K Explore
  allocation; ~87K credits if every GPU job runs twice as slowly.
- budget.py prints the plan with a week-by-week phase table; README,
  SILICA_3D_PLAN.md section 8 and the team summary updated to match.
</commit_message>
<xml_diff>
--- a/docs/Project_Summary.docx
+++ b/docs/Project_Summary.docx
@@ -82,7 +82,7 @@
           <w:sz w:val="22"/>
           <w:szCs w:val="22"/>
         </w:rPr>
-        <w:t xml:space="preserve">Updated 14 October 2026</w:t>
+        <w:t xml:space="preserve">Updated 16 October 2026</w:t>
       </w:r>
     </w:p>
     <w:p>
@@ -9246,7 +9246,7 @@
         <w:pStyle w:val="Heading1"/>
       </w:pPr>
       <w:r>
-        <w:t xml:space="preserve">8. Compute required</w:t>
+        <w:t xml:space="preserve">8. Compute required (upper plan)</w:t>
       </w:r>
     </w:p>
     <w:p>
@@ -9275,7 +9275,7 @@
         <w:spacing w:after="120" w:line="276"/>
       </w:pPr>
       <w:r>
-        <w:t xml:space="preserve">Credits use the PSC Explore guide: 200,000 credits buy about 3,700 GPU-hours (54 credits per GPU-hour), and 10,000 credits buy about 1 TB of storage. ACCESS treats one credit as roughly one CPU core-hour; the exact rate for PSC's CPU nodes should be checked in the ACCESS exchange calculator. The scripts and full tables are in docs/compute/ (run budget.py to change any assumption).</w:t>
+        <w:t xml:space="preserve">We use the upper plan: 64 short trial runs for the 3D model, 3,000 sampling steps, the optional quantum (DFT) check at its most expensive, the remaining 2D work included, and 20% extra on top for failed runs and surprises. Credits follow the PSC Explore guide: 200,000 credits buy about 3,700 GPU-hours (54 credits per GPU-hour), and 10,000 credits buy about 1 TB of storage. ACCESS treats one credit as roughly one CPU core-hour; the exact rate for PSC's CPU nodes should be checked in the ACCESS exchange calculator. Scripts and full tables are in docs/compute/.</w:t>
       </w:r>
     </w:p>
     <w:p>
@@ -9299,9 +9299,9 @@
         </w:tblBorders>
       </w:tblPr>
       <w:tblGrid>
-        <w:gridCol w:w="3200"/>
-        <w:gridCol w:w="3080"/>
-        <w:gridCol w:w="3080"/>
+        <w:gridCol w:w="2400"/>
+        <w:gridCol w:w="4160"/>
+        <w:gridCol w:w="2800"/>
       </w:tblGrid>
       <w:tr>
         <w:trPr>
@@ -9309,7 +9309,7 @@
         </w:trPr>
         <w:tc>
           <w:tcPr>
-            <w:tcW w:type="dxa" w:w="3200"/>
+            <w:tcW w:type="dxa" w:w="2400"/>
             <w:tcBorders>
               <w:top w:val="single" w:color="BFBFBF" w:sz="4"/>
               <w:left w:val="single" w:color="BFBFBF" w:sz="4"/>
@@ -9335,13 +9335,13 @@
                 <w:sz w:val="19"/>
                 <w:szCs w:val="19"/>
               </w:rPr>
-              <w:t xml:space="preserve"/>
-            </w:r>
-          </w:p>
-        </w:tc>
-        <w:tc>
-          <w:tcPr>
-            <w:tcW w:type="dxa" w:w="3080"/>
+              <w:t xml:space="preserve">Resource</w:t>
+            </w:r>
+          </w:p>
+        </w:tc>
+        <w:tc>
+          <w:tcPr>
+            <w:tcW w:type="dxa" w:w="4160"/>
             <w:tcBorders>
               <w:top w:val="single" w:color="BFBFBF" w:sz="4"/>
               <w:left w:val="single" w:color="BFBFBF" w:sz="4"/>
@@ -9367,13 +9367,13 @@
                 <w:sz w:val="19"/>
                 <w:szCs w:val="19"/>
               </w:rPr>
-              <w:t xml:space="preserve">Base plan</w:t>
-            </w:r>
-          </w:p>
-        </w:tc>
-        <w:tc>
-          <w:tcPr>
-            <w:tcW w:type="dxa" w:w="3080"/>
+              <w:t xml:space="preserve">Amount</w:t>
+            </w:r>
+          </w:p>
+        </w:tc>
+        <w:tc>
+          <w:tcPr>
+            <w:tcW w:type="dxa" w:w="2800"/>
             <w:tcBorders>
               <w:top w:val="single" w:color="BFBFBF" w:sz="4"/>
               <w:left w:val="single" w:color="BFBFBF" w:sz="4"/>
@@ -9399,7 +9399,7 @@
                 <w:sz w:val="19"/>
                 <w:szCs w:val="19"/>
               </w:rPr>
-              <w:t xml:space="preserve">Upper estimate</w:t>
+              <w:t xml:space="preserve">ACCESS credits</w:t>
             </w:r>
           </w:p>
         </w:tc>
@@ -9407,7 +9407,7 @@
       <w:tr>
         <w:tc>
           <w:tcPr>
-            <w:tcW w:type="dxa" w:w="3200"/>
+            <w:tcW w:type="dxa" w:w="2400"/>
             <w:tcBorders>
               <w:top w:val="single" w:color="BFBFBF" w:sz="4"/>
               <w:left w:val="single" w:color="BFBFBF" w:sz="4"/>
@@ -9432,69 +9432,69 @@
                 <w:sz w:val="19"/>
                 <w:szCs w:val="19"/>
               </w:rPr>
-              <w:t xml:space="preserve">GPU (3D models, sampling, checks)</w:t>
-            </w:r>
-          </w:p>
-        </w:tc>
-        <w:tc>
-          <w:tcPr>
-            <w:tcW w:type="dxa" w:w="3080"/>
-            <w:tcBorders>
-              <w:top w:val="single" w:color="BFBFBF" w:sz="4"/>
-              <w:left w:val="single" w:color="BFBFBF" w:sz="4"/>
-              <w:bottom w:val="single" w:color="BFBFBF" w:sz="4"/>
-              <w:right w:val="single" w:color="BFBFBF" w:sz="4"/>
-            </w:tcBorders>
-            <w:tcMar>
-              <w:top w:type="dxa" w:w="60"/>
-              <w:left w:type="dxa" w:w="100"/>
-              <w:bottom w:type="dxa" w:w="60"/>
-              <w:right w:type="dxa" w:w="100"/>
-            </w:tcMar>
-          </w:tcPr>
-          <w:p>
-            <w:pPr>
-              <w:spacing w:after="0" w:line="252"/>
-            </w:pPr>
-            <w:r>
-              <w:rPr>
-                <w:b w:val="false"/>
-                <w:bCs w:val="false"/>
-                <w:sz w:val="19"/>
-                <w:szCs w:val="19"/>
-              </w:rPr>
-              <w:t xml:space="preserve">347 GPU-hours = 18.8K credits</w:t>
-            </w:r>
-          </w:p>
-        </w:tc>
-        <w:tc>
-          <w:tcPr>
-            <w:tcW w:type="dxa" w:w="3080"/>
-            <w:tcBorders>
-              <w:top w:val="single" w:color="BFBFBF" w:sz="4"/>
-              <w:left w:val="single" w:color="BFBFBF" w:sz="4"/>
-              <w:bottom w:val="single" w:color="BFBFBF" w:sz="4"/>
-              <w:right w:val="single" w:color="BFBFBF" w:sz="4"/>
-            </w:tcBorders>
-            <w:tcMar>
-              <w:top w:type="dxa" w:w="60"/>
-              <w:left w:type="dxa" w:w="100"/>
-              <w:bottom w:type="dxa" w:w="60"/>
-              <w:right w:type="dxa" w:w="100"/>
-            </w:tcMar>
-          </w:tcPr>
-          <w:p>
-            <w:pPr>
-              <w:spacing w:after="0" w:line="252"/>
-            </w:pPr>
-            <w:r>
-              <w:rPr>
-                <w:b w:val="false"/>
-                <w:bCs w:val="false"/>
-                <w:sz w:val="19"/>
-                <w:szCs w:val="19"/>
-              </w:rPr>
-              <w:t xml:space="preserve">627 GPU-hours = 33.9K credits</w:t>
+              <w:t xml:space="preserve">GPU</w:t>
+            </w:r>
+          </w:p>
+        </w:tc>
+        <w:tc>
+          <w:tcPr>
+            <w:tcW w:type="dxa" w:w="4160"/>
+            <w:tcBorders>
+              <w:top w:val="single" w:color="BFBFBF" w:sz="4"/>
+              <w:left w:val="single" w:color="BFBFBF" w:sz="4"/>
+              <w:bottom w:val="single" w:color="BFBFBF" w:sz="4"/>
+              <w:right w:val="single" w:color="BFBFBF" w:sz="4"/>
+            </w:tcBorders>
+            <w:tcMar>
+              <w:top w:type="dxa" w:w="60"/>
+              <w:left w:type="dxa" w:w="100"/>
+              <w:bottom w:type="dxa" w:w="60"/>
+              <w:right w:type="dxa" w:w="100"/>
+            </w:tcMar>
+          </w:tcPr>
+          <w:p>
+            <w:pPr>
+              <w:spacing w:after="0" w:line="252"/>
+            </w:pPr>
+            <w:r>
+              <w:rPr>
+                <w:b w:val="false"/>
+                <w:bCs w:val="false"/>
+                <w:sz w:val="19"/>
+                <w:szCs w:val="19"/>
+              </w:rPr>
+              <w:t xml:space="preserve">(522 for 3D + 22 for 2D) × 1.2 = 653 GPU-hours</w:t>
+            </w:r>
+          </w:p>
+        </w:tc>
+        <w:tc>
+          <w:tcPr>
+            <w:tcW w:type="dxa" w:w="2800"/>
+            <w:tcBorders>
+              <w:top w:val="single" w:color="BFBFBF" w:sz="4"/>
+              <w:left w:val="single" w:color="BFBFBF" w:sz="4"/>
+              <w:bottom w:val="single" w:color="BFBFBF" w:sz="4"/>
+              <w:right w:val="single" w:color="BFBFBF" w:sz="4"/>
+            </w:tcBorders>
+            <w:tcMar>
+              <w:top w:type="dxa" w:w="60"/>
+              <w:left w:type="dxa" w:w="100"/>
+              <w:bottom w:type="dxa" w:w="60"/>
+              <w:right w:type="dxa" w:w="100"/>
+            </w:tcMar>
+          </w:tcPr>
+          <w:p>
+            <w:pPr>
+              <w:spacing w:after="0" w:line="252"/>
+            </w:pPr>
+            <w:r>
+              <w:rPr>
+                <w:b w:val="false"/>
+                <w:bCs w:val="false"/>
+                <w:sz w:val="19"/>
+                <w:szCs w:val="19"/>
+              </w:rPr>
+              <w:t xml:space="preserve">35,288</w:t>
             </w:r>
           </w:p>
         </w:tc>
@@ -9502,7 +9502,7 @@
       <w:tr>
         <w:tc>
           <w:tcPr>
-            <w:tcW w:type="dxa" w:w="3200"/>
+            <w:tcW w:type="dxa" w:w="2400"/>
             <w:tcBorders>
               <w:top w:val="single" w:color="BFBFBF" w:sz="4"/>
               <w:left w:val="single" w:color="BFBFBF" w:sz="4"/>
@@ -9527,69 +9527,69 @@
                 <w:sz w:val="19"/>
                 <w:szCs w:val="19"/>
               </w:rPr>
-              <w:t xml:space="preserve">CPU (simulations, baselines)</w:t>
-            </w:r>
-          </w:p>
-        </w:tc>
-        <w:tc>
-          <w:tcPr>
-            <w:tcW w:type="dxa" w:w="3080"/>
-            <w:tcBorders>
-              <w:top w:val="single" w:color="BFBFBF" w:sz="4"/>
-              <w:left w:val="single" w:color="BFBFBF" w:sz="4"/>
-              <w:bottom w:val="single" w:color="BFBFBF" w:sz="4"/>
-              <w:right w:val="single" w:color="BFBFBF" w:sz="4"/>
-            </w:tcBorders>
-            <w:tcMar>
-              <w:top w:type="dxa" w:w="60"/>
-              <w:left w:type="dxa" w:w="100"/>
-              <w:bottom w:type="dxa" w:w="60"/>
-              <w:right w:type="dxa" w:w="100"/>
-            </w:tcMar>
-          </w:tcPr>
-          <w:p>
-            <w:pPr>
-              <w:spacing w:after="0" w:line="252"/>
-            </w:pPr>
-            <w:r>
-              <w:rPr>
-                <w:b w:val="false"/>
-                <w:bCs w:val="false"/>
-                <w:sz w:val="19"/>
-                <w:szCs w:val="19"/>
-              </w:rPr>
-              <w:t xml:space="preserve">1,551 core-hours ≈ 1.6K credits</w:t>
-            </w:r>
-          </w:p>
-        </w:tc>
-        <w:tc>
-          <w:tcPr>
-            <w:tcW w:type="dxa" w:w="3080"/>
-            <w:tcBorders>
-              <w:top w:val="single" w:color="BFBFBF" w:sz="4"/>
-              <w:left w:val="single" w:color="BFBFBF" w:sz="4"/>
-              <w:bottom w:val="single" w:color="BFBFBF" w:sz="4"/>
-              <w:right w:val="single" w:color="BFBFBF" w:sz="4"/>
-            </w:tcBorders>
-            <w:tcMar>
-              <w:top w:type="dxa" w:w="60"/>
-              <w:left w:type="dxa" w:w="100"/>
-              <w:bottom w:type="dxa" w:w="60"/>
-              <w:right w:type="dxa" w:w="100"/>
-            </w:tcMar>
-          </w:tcPr>
-          <w:p>
-            <w:pPr>
-              <w:spacing w:after="0" w:line="252"/>
-            </w:pPr>
-            <w:r>
-              <w:rPr>
-                <w:b w:val="false"/>
-                <w:bCs w:val="false"/>
-                <w:sz w:val="19"/>
-                <w:szCs w:val="19"/>
-              </w:rPr>
-              <w:t xml:space="preserve">6,551 core-hours with the optional DFT check ≈ 6.6K credits</w:t>
+              <w:t xml:space="preserve">CPU</w:t>
+            </w:r>
+          </w:p>
+        </w:tc>
+        <w:tc>
+          <w:tcPr>
+            <w:tcW w:type="dxa" w:w="4160"/>
+            <w:tcBorders>
+              <w:top w:val="single" w:color="BFBFBF" w:sz="4"/>
+              <w:left w:val="single" w:color="BFBFBF" w:sz="4"/>
+              <w:bottom w:val="single" w:color="BFBFBF" w:sz="4"/>
+              <w:right w:val="single" w:color="BFBFBF" w:sz="4"/>
+            </w:tcBorders>
+            <w:tcMar>
+              <w:top w:type="dxa" w:w="60"/>
+              <w:left w:type="dxa" w:w="100"/>
+              <w:bottom w:type="dxa" w:w="60"/>
+              <w:right w:type="dxa" w:w="100"/>
+            </w:tcMar>
+          </w:tcPr>
+          <w:p>
+            <w:pPr>
+              <w:spacing w:after="0" w:line="252"/>
+            </w:pPr>
+            <w:r>
+              <w:rPr>
+                <w:b w:val="false"/>
+                <w:bCs w:val="false"/>
+                <w:sz w:val="19"/>
+                <w:szCs w:val="19"/>
+              </w:rPr>
+              <w:t xml:space="preserve">1,551 × 1.2 + 5,000 for DFT = 6,861 core-hours</w:t>
+            </w:r>
+          </w:p>
+        </w:tc>
+        <w:tc>
+          <w:tcPr>
+            <w:tcW w:type="dxa" w:w="2800"/>
+            <w:tcBorders>
+              <w:top w:val="single" w:color="BFBFBF" w:sz="4"/>
+              <w:left w:val="single" w:color="BFBFBF" w:sz="4"/>
+              <w:bottom w:val="single" w:color="BFBFBF" w:sz="4"/>
+              <w:right w:val="single" w:color="BFBFBF" w:sz="4"/>
+            </w:tcBorders>
+            <w:tcMar>
+              <w:top w:type="dxa" w:w="60"/>
+              <w:left w:type="dxa" w:w="100"/>
+              <w:bottom w:type="dxa" w:w="60"/>
+              <w:right w:type="dxa" w:w="100"/>
+            </w:tcMar>
+          </w:tcPr>
+          <w:p>
+            <w:pPr>
+              <w:spacing w:after="0" w:line="252"/>
+            </w:pPr>
+            <w:r>
+              <w:rPr>
+                <w:b w:val="false"/>
+                <w:bCs w:val="false"/>
+                <w:sz w:val="19"/>
+                <w:szCs w:val="19"/>
+              </w:rPr>
+              <w:t xml:space="preserve">about 6,900</w:t>
             </w:r>
           </w:p>
         </w:tc>
@@ -9597,7 +9597,7 @@
       <w:tr>
         <w:tc>
           <w:tcPr>
-            <w:tcW w:type="dxa" w:w="3200"/>
+            <w:tcW w:type="dxa" w:w="2400"/>
             <w:tcBorders>
               <w:top w:val="single" w:color="BFBFBF" w:sz="4"/>
               <w:left w:val="single" w:color="BFBFBF" w:sz="4"/>
@@ -9628,63 +9628,63 @@
         </w:tc>
         <w:tc>
           <w:tcPr>
-            <w:tcW w:type="dxa" w:w="3080"/>
-            <w:tcBorders>
-              <w:top w:val="single" w:color="BFBFBF" w:sz="4"/>
-              <w:left w:val="single" w:color="BFBFBF" w:sz="4"/>
-              <w:bottom w:val="single" w:color="BFBFBF" w:sz="4"/>
-              <w:right w:val="single" w:color="BFBFBF" w:sz="4"/>
-            </w:tcBorders>
-            <w:tcMar>
-              <w:top w:type="dxa" w:w="60"/>
-              <w:left w:type="dxa" w:w="100"/>
-              <w:bottom w:type="dxa" w:w="60"/>
-              <w:right w:type="dxa" w:w="100"/>
-            </w:tcMar>
-          </w:tcPr>
-          <w:p>
-            <w:pPr>
-              <w:spacing w:after="0" w:line="252"/>
-            </w:pPr>
-            <w:r>
-              <w:rPr>
-                <w:b w:val="false"/>
-                <w:bCs w:val="false"/>
-                <w:sz w:val="19"/>
-                <w:szCs w:val="19"/>
-              </w:rPr>
-              <w:t xml:space="preserve">1 TB = 10K credits</w:t>
-            </w:r>
-          </w:p>
-        </w:tc>
-        <w:tc>
-          <w:tcPr>
-            <w:tcW w:type="dxa" w:w="3080"/>
-            <w:tcBorders>
-              <w:top w:val="single" w:color="BFBFBF" w:sz="4"/>
-              <w:left w:val="single" w:color="BFBFBF" w:sz="4"/>
-              <w:bottom w:val="single" w:color="BFBFBF" w:sz="4"/>
-              <w:right w:val="single" w:color="BFBFBF" w:sz="4"/>
-            </w:tcBorders>
-            <w:tcMar>
-              <w:top w:type="dxa" w:w="60"/>
-              <w:left w:type="dxa" w:w="100"/>
-              <w:bottom w:type="dxa" w:w="60"/>
-              <w:right w:type="dxa" w:w="100"/>
-            </w:tcMar>
-          </w:tcPr>
-          <w:p>
-            <w:pPr>
-              <w:spacing w:after="0" w:line="252"/>
-            </w:pPr>
-            <w:r>
-              <w:rPr>
-                <w:b w:val="false"/>
-                <w:bCs w:val="false"/>
-                <w:sz w:val="19"/>
-                <w:szCs w:val="19"/>
-              </w:rPr>
-              <w:t xml:space="preserve">1 TB = 10K credits</w:t>
+            <w:tcW w:type="dxa" w:w="4160"/>
+            <w:tcBorders>
+              <w:top w:val="single" w:color="BFBFBF" w:sz="4"/>
+              <w:left w:val="single" w:color="BFBFBF" w:sz="4"/>
+              <w:bottom w:val="single" w:color="BFBFBF" w:sz="4"/>
+              <w:right w:val="single" w:color="BFBFBF" w:sz="4"/>
+            </w:tcBorders>
+            <w:tcMar>
+              <w:top w:type="dxa" w:w="60"/>
+              <w:left w:type="dxa" w:w="100"/>
+              <w:bottom w:type="dxa" w:w="60"/>
+              <w:right w:type="dxa" w:w="100"/>
+            </w:tcMar>
+          </w:tcPr>
+          <w:p>
+            <w:pPr>
+              <w:spacing w:after="0" w:line="252"/>
+            </w:pPr>
+            <w:r>
+              <w:rPr>
+                <w:b w:val="false"/>
+                <w:bCs w:val="false"/>
+                <w:sz w:val="19"/>
+                <w:szCs w:val="19"/>
+              </w:rPr>
+              <w:t xml:space="preserve">1 TB</w:t>
+            </w:r>
+          </w:p>
+        </w:tc>
+        <w:tc>
+          <w:tcPr>
+            <w:tcW w:type="dxa" w:w="2800"/>
+            <w:tcBorders>
+              <w:top w:val="single" w:color="BFBFBF" w:sz="4"/>
+              <w:left w:val="single" w:color="BFBFBF" w:sz="4"/>
+              <w:bottom w:val="single" w:color="BFBFBF" w:sz="4"/>
+              <w:right w:val="single" w:color="BFBFBF" w:sz="4"/>
+            </w:tcBorders>
+            <w:tcMar>
+              <w:top w:type="dxa" w:w="60"/>
+              <w:left w:type="dxa" w:w="100"/>
+              <w:bottom w:type="dxa" w:w="60"/>
+              <w:right w:type="dxa" w:w="100"/>
+            </w:tcMar>
+          </w:tcPr>
+          <w:p>
+            <w:pPr>
+              <w:spacing w:after="0" w:line="252"/>
+            </w:pPr>
+            <w:r>
+              <w:rPr>
+                <w:b w:val="false"/>
+                <w:bCs w:val="false"/>
+                <w:sz w:val="19"/>
+                <w:szCs w:val="19"/>
+              </w:rPr>
+              <w:t xml:space="preserve">10,000</w:t>
             </w:r>
           </w:p>
         </w:tc>
@@ -9692,7 +9692,7 @@
       <w:tr>
         <w:tc>
           <w:tcPr>
-            <w:tcW w:type="dxa" w:w="3200"/>
+            <w:tcW w:type="dxa" w:w="2400"/>
             <w:tcBorders>
               <w:top w:val="single" w:color="BFBFBF" w:sz="4"/>
               <w:left w:val="single" w:color="BFBFBF" w:sz="4"/>
@@ -9724,7 +9724,7 @@
         </w:tc>
         <w:tc>
           <w:tcPr>
-            <w:tcW w:type="dxa" w:w="3080"/>
+            <w:tcW w:type="dxa" w:w="4160"/>
             <w:tcBorders>
               <w:top w:val="single" w:color="BFBFBF" w:sz="4"/>
               <w:left w:val="single" w:color="BFBFBF" w:sz="4"/>
@@ -9750,13 +9750,13 @@
                 <w:sz w:val="19"/>
                 <w:szCs w:val="19"/>
               </w:rPr>
-              <w:t xml:space="preserve">about 30K credits</w:t>
-            </w:r>
-          </w:p>
-        </w:tc>
-        <w:tc>
-          <w:tcPr>
-            <w:tcW w:type="dxa" w:w="3080"/>
+              <w:t xml:space="preserve"/>
+            </w:r>
+          </w:p>
+        </w:tc>
+        <w:tc>
+          <w:tcPr>
+            <w:tcW w:type="dxa" w:w="2800"/>
             <w:tcBorders>
               <w:top w:val="single" w:color="BFBFBF" w:sz="4"/>
               <w:left w:val="single" w:color="BFBFBF" w:sz="4"/>
@@ -9782,102 +9782,7 @@
                 <w:sz w:val="19"/>
                 <w:szCs w:val="19"/>
               </w:rPr>
-              <w:t xml:space="preserve">about 50K credits</w:t>
-            </w:r>
-          </w:p>
-        </w:tc>
-      </w:tr>
-      <w:tr>
-        <w:tc>
-          <w:tcPr>
-            <w:tcW w:type="dxa" w:w="3200"/>
-            <w:tcBorders>
-              <w:top w:val="single" w:color="BFBFBF" w:sz="4"/>
-              <w:left w:val="single" w:color="BFBFBF" w:sz="4"/>
-              <w:bottom w:val="single" w:color="BFBFBF" w:sz="4"/>
-              <w:right w:val="single" w:color="BFBFBF" w:sz="4"/>
-            </w:tcBorders>
-            <w:tcMar>
-              <w:top w:type="dxa" w:w="60"/>
-              <w:left w:type="dxa" w:w="100"/>
-              <w:bottom w:type="dxa" w:w="60"/>
-              <w:right w:type="dxa" w:w="100"/>
-            </w:tcMar>
-          </w:tcPr>
-          <w:p>
-            <w:pPr>
-              <w:spacing w:after="0" w:line="252"/>
-            </w:pPr>
-            <w:r>
-              <w:rPr>
-                <w:b/>
-                <w:bCs/>
-                <w:sz w:val="19"/>
-                <w:szCs w:val="19"/>
-              </w:rPr>
-              <w:t xml:space="preserve">2D work left (Kaggle, free)</w:t>
-            </w:r>
-          </w:p>
-        </w:tc>
-        <w:tc>
-          <w:tcPr>
-            <w:tcW w:type="dxa" w:w="3080"/>
-            <w:tcBorders>
-              <w:top w:val="single" w:color="BFBFBF" w:sz="4"/>
-              <w:left w:val="single" w:color="BFBFBF" w:sz="4"/>
-              <w:bottom w:val="single" w:color="BFBFBF" w:sz="4"/>
-              <w:right w:val="single" w:color="BFBFBF" w:sz="4"/>
-            </w:tcBorders>
-            <w:tcMar>
-              <w:top w:type="dxa" w:w="60"/>
-              <w:left w:type="dxa" w:w="100"/>
-              <w:bottom w:type="dxa" w:w="60"/>
-              <w:right w:type="dxa" w:w="100"/>
-            </w:tcMar>
-          </w:tcPr>
-          <w:p>
-            <w:pPr>
-              <w:spacing w:after="0" w:line="252"/>
-            </w:pPr>
-            <w:r>
-              <w:rPr>
-                <w:b w:val="false"/>
-                <w:bCs w:val="false"/>
-                <w:sz w:val="19"/>
-                <w:szCs w:val="19"/>
-              </w:rPr>
-              <w:t xml:space="preserve">22 GPU-hours</w:t>
-            </w:r>
-          </w:p>
-        </w:tc>
-        <w:tc>
-          <w:tcPr>
-            <w:tcW w:type="dxa" w:w="3080"/>
-            <w:tcBorders>
-              <w:top w:val="single" w:color="BFBFBF" w:sz="4"/>
-              <w:left w:val="single" w:color="BFBFBF" w:sz="4"/>
-              <w:bottom w:val="single" w:color="BFBFBF" w:sz="4"/>
-              <w:right w:val="single" w:color="BFBFBF" w:sz="4"/>
-            </w:tcBorders>
-            <w:tcMar>
-              <w:top w:type="dxa" w:w="60"/>
-              <w:left w:type="dxa" w:w="100"/>
-              <w:bottom w:type="dxa" w:w="60"/>
-              <w:right w:type="dxa" w:w="100"/>
-            </w:tcMar>
-          </w:tcPr>
-          <w:p>
-            <w:pPr>
-              <w:spacing w:after="0" w:line="252"/>
-            </w:pPr>
-            <w:r>
-              <w:rPr>
-                <w:b w:val="false"/>
-                <w:bCs w:val="false"/>
-                <w:sz w:val="19"/>
-                <w:szCs w:val="19"/>
-              </w:rPr>
-              <w:t xml:space="preserve"/>
+              <w:t xml:space="preserve">about 52,100 (26% of 200K)</w:t>
             </w:r>
           </w:p>
         </w:tc>
@@ -9888,7 +9793,7 @@
         <w:spacing w:after="120" w:before="160"/>
       </w:pPr>
       <w:r>
-        <w:t xml:space="preserve">An Explore allocation (200K credits) covers even the upper estimate about four times over. The spare credits leave room for larger glass cells, more ablations or the DFT check.</w:t>
+        <w:t xml:space="preserve">Safety check: if every GPU job turns out twice as slow as planned, the total rises to about 87,000 credits, still under half of an Explore allocation.</w:t>
       </w:r>
     </w:p>
     <w:p>
@@ -9896,7 +9801,1501 @@
         <w:pStyle w:val="Heading2"/>
       </w:pPr>
       <w:r>
-        <w:t xml:space="preserve">8.2 Where the epoch times come from</w:t>
+        <w:t xml:space="preserve">8.2 By phase</w:t>
+      </w:r>
+    </w:p>
+    <w:tbl>
+      <w:tblPr>
+        <w:tblW w:type="dxa" w:w="9360"/>
+        <w:tblBorders>
+          <w:top w:val="single" w:color="auto" w:sz="4"/>
+          <w:left w:val="single" w:color="auto" w:sz="4"/>
+          <w:bottom w:val="single" w:color="auto" w:sz="4"/>
+          <w:right w:val="single" w:color="auto" w:sz="4"/>
+          <w:insideH w:val="single" w:color="auto" w:sz="4"/>
+          <w:insideV w:val="single" w:color="auto" w:sz="4"/>
+        </w:tblBorders>
+      </w:tblPr>
+      <w:tblGrid>
+        <w:gridCol w:w="900"/>
+        <w:gridCol w:w="4660"/>
+        <w:gridCol w:w="1200"/>
+        <w:gridCol w:w="1200"/>
+        <w:gridCol w:w="1400"/>
+      </w:tblGrid>
+      <w:tr>
+        <w:trPr>
+          <w:tblHeader/>
+        </w:trPr>
+        <w:tc>
+          <w:tcPr>
+            <w:tcW w:type="dxa" w:w="900"/>
+            <w:tcBorders>
+              <w:top w:val="single" w:color="BFBFBF" w:sz="4"/>
+              <w:left w:val="single" w:color="BFBFBF" w:sz="4"/>
+              <w:bottom w:val="single" w:color="BFBFBF" w:sz="4"/>
+              <w:right w:val="single" w:color="BFBFBF" w:sz="4"/>
+            </w:tcBorders>
+            <w:shd w:fill="DCE8F5" w:color="auto" w:val="clear"/>
+            <w:tcMar>
+              <w:top w:type="dxa" w:w="60"/>
+              <w:left w:type="dxa" w:w="100"/>
+              <w:bottom w:type="dxa" w:w="60"/>
+              <w:right w:type="dxa" w:w="100"/>
+            </w:tcMar>
+          </w:tcPr>
+          <w:p>
+            <w:pPr>
+              <w:spacing w:after="0" w:line="252"/>
+            </w:pPr>
+            <w:r>
+              <w:rPr>
+                <w:b/>
+                <w:bCs/>
+                <w:sz w:val="19"/>
+                <w:szCs w:val="19"/>
+              </w:rPr>
+              <w:t xml:space="preserve">Weeks</w:t>
+            </w:r>
+          </w:p>
+        </w:tc>
+        <w:tc>
+          <w:tcPr>
+            <w:tcW w:type="dxa" w:w="4660"/>
+            <w:tcBorders>
+              <w:top w:val="single" w:color="BFBFBF" w:sz="4"/>
+              <w:left w:val="single" w:color="BFBFBF" w:sz="4"/>
+              <w:bottom w:val="single" w:color="BFBFBF" w:sz="4"/>
+              <w:right w:val="single" w:color="BFBFBF" w:sz="4"/>
+            </w:tcBorders>
+            <w:shd w:fill="DCE8F5" w:color="auto" w:val="clear"/>
+            <w:tcMar>
+              <w:top w:type="dxa" w:w="60"/>
+              <w:left w:type="dxa" w:w="100"/>
+              <w:bottom w:type="dxa" w:w="60"/>
+              <w:right w:type="dxa" w:w="100"/>
+            </w:tcMar>
+          </w:tcPr>
+          <w:p>
+            <w:pPr>
+              <w:spacing w:after="0" w:line="252"/>
+            </w:pPr>
+            <w:r>
+              <w:rPr>
+                <w:b/>
+                <w:bCs/>
+                <w:sz w:val="19"/>
+                <w:szCs w:val="19"/>
+              </w:rPr>
+              <w:t xml:space="preserve">Stage</w:t>
+            </w:r>
+          </w:p>
+        </w:tc>
+        <w:tc>
+          <w:tcPr>
+            <w:tcW w:type="dxa" w:w="1200"/>
+            <w:tcBorders>
+              <w:top w:val="single" w:color="BFBFBF" w:sz="4"/>
+              <w:left w:val="single" w:color="BFBFBF" w:sz="4"/>
+              <w:bottom w:val="single" w:color="BFBFBF" w:sz="4"/>
+              <w:right w:val="single" w:color="BFBFBF" w:sz="4"/>
+            </w:tcBorders>
+            <w:shd w:fill="DCE8F5" w:color="auto" w:val="clear"/>
+            <w:tcMar>
+              <w:top w:type="dxa" w:w="60"/>
+              <w:left w:type="dxa" w:w="100"/>
+              <w:bottom w:type="dxa" w:w="60"/>
+              <w:right w:type="dxa" w:w="100"/>
+            </w:tcMar>
+          </w:tcPr>
+          <w:p>
+            <w:pPr>
+              <w:spacing w:after="0" w:line="252"/>
+            </w:pPr>
+            <w:r>
+              <w:rPr>
+                <w:b/>
+                <w:bCs/>
+                <w:sz w:val="19"/>
+                <w:szCs w:val="19"/>
+              </w:rPr>
+              <w:t xml:space="preserve">GPU-hours</w:t>
+            </w:r>
+          </w:p>
+        </w:tc>
+        <w:tc>
+          <w:tcPr>
+            <w:tcW w:type="dxa" w:w="1200"/>
+            <w:tcBorders>
+              <w:top w:val="single" w:color="BFBFBF" w:sz="4"/>
+              <w:left w:val="single" w:color="BFBFBF" w:sz="4"/>
+              <w:bottom w:val="single" w:color="BFBFBF" w:sz="4"/>
+              <w:right w:val="single" w:color="BFBFBF" w:sz="4"/>
+            </w:tcBorders>
+            <w:shd w:fill="DCE8F5" w:color="auto" w:val="clear"/>
+            <w:tcMar>
+              <w:top w:type="dxa" w:w="60"/>
+              <w:left w:type="dxa" w:w="100"/>
+              <w:bottom w:type="dxa" w:w="60"/>
+              <w:right w:type="dxa" w:w="100"/>
+            </w:tcMar>
+          </w:tcPr>
+          <w:p>
+            <w:pPr>
+              <w:spacing w:after="0" w:line="252"/>
+            </w:pPr>
+            <w:r>
+              <w:rPr>
+                <w:b/>
+                <w:bCs/>
+                <w:sz w:val="19"/>
+                <w:szCs w:val="19"/>
+              </w:rPr>
+              <w:t xml:space="preserve">Core-hours</w:t>
+            </w:r>
+          </w:p>
+        </w:tc>
+        <w:tc>
+          <w:tcPr>
+            <w:tcW w:type="dxa" w:w="1400"/>
+            <w:tcBorders>
+              <w:top w:val="single" w:color="BFBFBF" w:sz="4"/>
+              <w:left w:val="single" w:color="BFBFBF" w:sz="4"/>
+              <w:bottom w:val="single" w:color="BFBFBF" w:sz="4"/>
+              <w:right w:val="single" w:color="BFBFBF" w:sz="4"/>
+            </w:tcBorders>
+            <w:shd w:fill="DCE8F5" w:color="auto" w:val="clear"/>
+            <w:tcMar>
+              <w:top w:type="dxa" w:w="60"/>
+              <w:left w:type="dxa" w:w="100"/>
+              <w:bottom w:type="dxa" w:w="60"/>
+              <w:right w:type="dxa" w:w="100"/>
+            </w:tcMar>
+          </w:tcPr>
+          <w:p>
+            <w:pPr>
+              <w:spacing w:after="0" w:line="252"/>
+            </w:pPr>
+            <w:r>
+              <w:rPr>
+                <w:b/>
+                <w:bCs/>
+                <w:sz w:val="19"/>
+                <w:szCs w:val="19"/>
+              </w:rPr>
+              <w:t xml:space="preserve">Credits</w:t>
+            </w:r>
+          </w:p>
+        </w:tc>
+      </w:tr>
+      <w:tr>
+        <w:tc>
+          <w:tcPr>
+            <w:tcW w:type="dxa" w:w="900"/>
+            <w:tcBorders>
+              <w:top w:val="single" w:color="BFBFBF" w:sz="4"/>
+              <w:left w:val="single" w:color="BFBFBF" w:sz="4"/>
+              <w:bottom w:val="single" w:color="BFBFBF" w:sz="4"/>
+              <w:right w:val="single" w:color="BFBFBF" w:sz="4"/>
+            </w:tcBorders>
+            <w:tcMar>
+              <w:top w:type="dxa" w:w="60"/>
+              <w:left w:type="dxa" w:w="100"/>
+              <w:bottom w:type="dxa" w:w="60"/>
+              <w:right w:type="dxa" w:w="100"/>
+            </w:tcMar>
+          </w:tcPr>
+          <w:p>
+            <w:pPr>
+              <w:spacing w:after="0" w:line="252"/>
+              <w:jc w:val="center"/>
+            </w:pPr>
+            <w:r>
+              <w:rPr>
+                <w:b w:val="false"/>
+                <w:bCs w:val="false"/>
+                <w:sz w:val="19"/>
+                <w:szCs w:val="19"/>
+              </w:rPr>
+              <w:t xml:space="preserve">1–3</w:t>
+            </w:r>
+          </w:p>
+        </w:tc>
+        <w:tc>
+          <w:tcPr>
+            <w:tcW w:type="dxa" w:w="4660"/>
+            <w:tcBorders>
+              <w:top w:val="single" w:color="BFBFBF" w:sz="4"/>
+              <w:left w:val="single" w:color="BFBFBF" w:sz="4"/>
+              <w:bottom w:val="single" w:color="BFBFBF" w:sz="4"/>
+              <w:right w:val="single" w:color="BFBFBF" w:sz="4"/>
+            </w:tcBorders>
+            <w:tcMar>
+              <w:top w:type="dxa" w:w="60"/>
+              <w:left w:type="dxa" w:w="100"/>
+              <w:bottom w:type="dxa" w:w="60"/>
+              <w:right w:type="dxa" w:w="100"/>
+            </w:tcMar>
+          </w:tcPr>
+          <w:p>
+            <w:pPr>
+              <w:spacing w:after="0" w:line="252"/>
+            </w:pPr>
+            <w:r>
+              <w:rPr>
+                <w:b w:val="false"/>
+                <w:bCs w:val="false"/>
+                <w:sz w:val="19"/>
+                <w:szCs w:val="19"/>
+              </w:rPr>
+              <w:t xml:space="preserve">Finish the 2D paper (optional runs)</w:t>
+            </w:r>
+          </w:p>
+        </w:tc>
+        <w:tc>
+          <w:tcPr>
+            <w:tcW w:type="dxa" w:w="1200"/>
+            <w:tcBorders>
+              <w:top w:val="single" w:color="BFBFBF" w:sz="4"/>
+              <w:left w:val="single" w:color="BFBFBF" w:sz="4"/>
+              <w:bottom w:val="single" w:color="BFBFBF" w:sz="4"/>
+              <w:right w:val="single" w:color="BFBFBF" w:sz="4"/>
+            </w:tcBorders>
+            <w:tcMar>
+              <w:top w:type="dxa" w:w="60"/>
+              <w:left w:type="dxa" w:w="100"/>
+              <w:bottom w:type="dxa" w:w="60"/>
+              <w:right w:type="dxa" w:w="100"/>
+            </w:tcMar>
+          </w:tcPr>
+          <w:p>
+            <w:pPr>
+              <w:spacing w:after="0" w:line="252"/>
+              <w:jc w:val="center"/>
+            </w:pPr>
+            <w:r>
+              <w:rPr>
+                <w:b w:val="false"/>
+                <w:bCs w:val="false"/>
+                <w:sz w:val="19"/>
+                <w:szCs w:val="19"/>
+              </w:rPr>
+              <w:t xml:space="preserve">26</w:t>
+            </w:r>
+          </w:p>
+        </w:tc>
+        <w:tc>
+          <w:tcPr>
+            <w:tcW w:type="dxa" w:w="1200"/>
+            <w:tcBorders>
+              <w:top w:val="single" w:color="BFBFBF" w:sz="4"/>
+              <w:left w:val="single" w:color="BFBFBF" w:sz="4"/>
+              <w:bottom w:val="single" w:color="BFBFBF" w:sz="4"/>
+              <w:right w:val="single" w:color="BFBFBF" w:sz="4"/>
+            </w:tcBorders>
+            <w:tcMar>
+              <w:top w:type="dxa" w:w="60"/>
+              <w:left w:type="dxa" w:w="100"/>
+              <w:bottom w:type="dxa" w:w="60"/>
+              <w:right w:type="dxa" w:w="100"/>
+            </w:tcMar>
+          </w:tcPr>
+          <w:p>
+            <w:pPr>
+              <w:spacing w:after="0" w:line="252"/>
+              <w:jc w:val="center"/>
+            </w:pPr>
+            <w:r>
+              <w:rPr>
+                <w:b w:val="false"/>
+                <w:bCs w:val="false"/>
+                <w:sz w:val="19"/>
+                <w:szCs w:val="19"/>
+              </w:rPr>
+              <w:t xml:space="preserve">0</w:t>
+            </w:r>
+          </w:p>
+        </w:tc>
+        <w:tc>
+          <w:tcPr>
+            <w:tcW w:type="dxa" w:w="1400"/>
+            <w:tcBorders>
+              <w:top w:val="single" w:color="BFBFBF" w:sz="4"/>
+              <w:left w:val="single" w:color="BFBFBF" w:sz="4"/>
+              <w:bottom w:val="single" w:color="BFBFBF" w:sz="4"/>
+              <w:right w:val="single" w:color="BFBFBF" w:sz="4"/>
+            </w:tcBorders>
+            <w:tcMar>
+              <w:top w:type="dxa" w:w="60"/>
+              <w:left w:type="dxa" w:w="100"/>
+              <w:bottom w:type="dxa" w:w="60"/>
+              <w:right w:type="dxa" w:w="100"/>
+            </w:tcMar>
+          </w:tcPr>
+          <w:p>
+            <w:pPr>
+              <w:spacing w:after="0" w:line="252"/>
+              <w:jc w:val="center"/>
+            </w:pPr>
+            <w:r>
+              <w:rPr>
+                <w:b w:val="false"/>
+                <w:bCs w:val="false"/>
+                <w:sz w:val="19"/>
+                <w:szCs w:val="19"/>
+              </w:rPr>
+              <w:t xml:space="preserve">1,420</w:t>
+            </w:r>
+          </w:p>
+        </w:tc>
+      </w:tr>
+      <w:tr>
+        <w:tc>
+          <w:tcPr>
+            <w:tcW w:type="dxa" w:w="900"/>
+            <w:tcBorders>
+              <w:top w:val="single" w:color="BFBFBF" w:sz="4"/>
+              <w:left w:val="single" w:color="BFBFBF" w:sz="4"/>
+              <w:bottom w:val="single" w:color="BFBFBF" w:sz="4"/>
+              <w:right w:val="single" w:color="BFBFBF" w:sz="4"/>
+            </w:tcBorders>
+            <w:tcMar>
+              <w:top w:type="dxa" w:w="60"/>
+              <w:left w:type="dxa" w:w="100"/>
+              <w:bottom w:type="dxa" w:w="60"/>
+              <w:right w:type="dxa" w:w="100"/>
+            </w:tcMar>
+          </w:tcPr>
+          <w:p>
+            <w:pPr>
+              <w:spacing w:after="0" w:line="252"/>
+              <w:jc w:val="center"/>
+            </w:pPr>
+            <w:r>
+              <w:rPr>
+                <w:b w:val="false"/>
+                <w:bCs w:val="false"/>
+                <w:sz w:val="19"/>
+                <w:szCs w:val="19"/>
+              </w:rPr>
+              <w:t xml:space="preserve">1–2</w:t>
+            </w:r>
+          </w:p>
+        </w:tc>
+        <w:tc>
+          <w:tcPr>
+            <w:tcW w:type="dxa" w:w="4660"/>
+            <w:tcBorders>
+              <w:top w:val="single" w:color="BFBFBF" w:sz="4"/>
+              <w:left w:val="single" w:color="BFBFBF" w:sz="4"/>
+              <w:bottom w:val="single" w:color="BFBFBF" w:sz="4"/>
+              <w:right w:val="single" w:color="BFBFBF" w:sz="4"/>
+            </w:tcBorders>
+            <w:tcMar>
+              <w:top w:type="dxa" w:w="60"/>
+              <w:left w:type="dxa" w:w="100"/>
+              <w:bottom w:type="dxa" w:w="60"/>
+              <w:right w:type="dxa" w:w="100"/>
+            </w:tcMar>
+          </w:tcPr>
+          <w:p>
+            <w:pPr>
+              <w:spacing w:after="0" w:line="252"/>
+            </w:pPr>
+            <w:r>
+              <w:rPr>
+                <w:b w:val="false"/>
+                <w:bCs w:val="false"/>
+                <w:sz w:val="19"/>
+                <w:szCs w:val="19"/>
+              </w:rPr>
+              <w:t xml:space="preserve">Setup: computing time, simulation check, benchmarks</w:t>
+            </w:r>
+          </w:p>
+        </w:tc>
+        <w:tc>
+          <w:tcPr>
+            <w:tcW w:type="dxa" w:w="1200"/>
+            <w:tcBorders>
+              <w:top w:val="single" w:color="BFBFBF" w:sz="4"/>
+              <w:left w:val="single" w:color="BFBFBF" w:sz="4"/>
+              <w:bottom w:val="single" w:color="BFBFBF" w:sz="4"/>
+              <w:right w:val="single" w:color="BFBFBF" w:sz="4"/>
+            </w:tcBorders>
+            <w:tcMar>
+              <w:top w:type="dxa" w:w="60"/>
+              <w:left w:type="dxa" w:w="100"/>
+              <w:bottom w:type="dxa" w:w="60"/>
+              <w:right w:type="dxa" w:w="100"/>
+            </w:tcMar>
+          </w:tcPr>
+          <w:p>
+            <w:pPr>
+              <w:spacing w:after="0" w:line="252"/>
+              <w:jc w:val="center"/>
+            </w:pPr>
+            <w:r>
+              <w:rPr>
+                <w:b w:val="false"/>
+                <w:bCs w:val="false"/>
+                <w:sz w:val="19"/>
+                <w:szCs w:val="19"/>
+              </w:rPr>
+              <w:t xml:space="preserve">18</w:t>
+            </w:r>
+          </w:p>
+        </w:tc>
+        <w:tc>
+          <w:tcPr>
+            <w:tcW w:type="dxa" w:w="1200"/>
+            <w:tcBorders>
+              <w:top w:val="single" w:color="BFBFBF" w:sz="4"/>
+              <w:left w:val="single" w:color="BFBFBF" w:sz="4"/>
+              <w:bottom w:val="single" w:color="BFBFBF" w:sz="4"/>
+              <w:right w:val="single" w:color="BFBFBF" w:sz="4"/>
+            </w:tcBorders>
+            <w:tcMar>
+              <w:top w:type="dxa" w:w="60"/>
+              <w:left w:type="dxa" w:w="100"/>
+              <w:bottom w:type="dxa" w:w="60"/>
+              <w:right w:type="dxa" w:w="100"/>
+            </w:tcMar>
+          </w:tcPr>
+          <w:p>
+            <w:pPr>
+              <w:spacing w:after="0" w:line="252"/>
+              <w:jc w:val="center"/>
+            </w:pPr>
+            <w:r>
+              <w:rPr>
+                <w:b w:val="false"/>
+                <w:bCs w:val="false"/>
+                <w:sz w:val="19"/>
+                <w:szCs w:val="19"/>
+              </w:rPr>
+              <w:t xml:space="preserve">0</w:t>
+            </w:r>
+          </w:p>
+        </w:tc>
+        <w:tc>
+          <w:tcPr>
+            <w:tcW w:type="dxa" w:w="1400"/>
+            <w:tcBorders>
+              <w:top w:val="single" w:color="BFBFBF" w:sz="4"/>
+              <w:left w:val="single" w:color="BFBFBF" w:sz="4"/>
+              <w:bottom w:val="single" w:color="BFBFBF" w:sz="4"/>
+              <w:right w:val="single" w:color="BFBFBF" w:sz="4"/>
+            </w:tcBorders>
+            <w:tcMar>
+              <w:top w:type="dxa" w:w="60"/>
+              <w:left w:type="dxa" w:w="100"/>
+              <w:bottom w:type="dxa" w:w="60"/>
+              <w:right w:type="dxa" w:w="100"/>
+            </w:tcMar>
+          </w:tcPr>
+          <w:p>
+            <w:pPr>
+              <w:spacing w:after="0" w:line="252"/>
+              <w:jc w:val="center"/>
+            </w:pPr>
+            <w:r>
+              <w:rPr>
+                <w:b w:val="false"/>
+                <w:bCs w:val="false"/>
+                <w:sz w:val="19"/>
+                <w:szCs w:val="19"/>
+              </w:rPr>
+              <w:t xml:space="preserve">973</w:t>
+            </w:r>
+          </w:p>
+        </w:tc>
+      </w:tr>
+      <w:tr>
+        <w:tc>
+          <w:tcPr>
+            <w:tcW w:type="dxa" w:w="900"/>
+            <w:tcBorders>
+              <w:top w:val="single" w:color="BFBFBF" w:sz="4"/>
+              <w:left w:val="single" w:color="BFBFBF" w:sz="4"/>
+              <w:bottom w:val="single" w:color="BFBFBF" w:sz="4"/>
+              <w:right w:val="single" w:color="BFBFBF" w:sz="4"/>
+            </w:tcBorders>
+            <w:tcMar>
+              <w:top w:type="dxa" w:w="60"/>
+              <w:left w:type="dxa" w:w="100"/>
+              <w:bottom w:type="dxa" w:w="60"/>
+              <w:right w:type="dxa" w:w="100"/>
+            </w:tcMar>
+          </w:tcPr>
+          <w:p>
+            <w:pPr>
+              <w:spacing w:after="0" w:line="252"/>
+              <w:jc w:val="center"/>
+            </w:pPr>
+            <w:r>
+              <w:rPr>
+                <w:b w:val="false"/>
+                <w:bCs w:val="false"/>
+                <w:sz w:val="19"/>
+                <w:szCs w:val="19"/>
+              </w:rPr>
+              <w:t xml:space="preserve">2–5</w:t>
+            </w:r>
+          </w:p>
+        </w:tc>
+        <w:tc>
+          <w:tcPr>
+            <w:tcW w:type="dxa" w:w="4660"/>
+            <w:tcBorders>
+              <w:top w:val="single" w:color="BFBFBF" w:sz="4"/>
+              <w:left w:val="single" w:color="BFBFBF" w:sz="4"/>
+              <w:bottom w:val="single" w:color="BFBFBF" w:sz="4"/>
+              <w:right w:val="single" w:color="BFBFBF" w:sz="4"/>
+            </w:tcBorders>
+            <w:tcMar>
+              <w:top w:type="dxa" w:w="60"/>
+              <w:left w:type="dxa" w:w="100"/>
+              <w:bottom w:type="dxa" w:w="60"/>
+              <w:right w:type="dxa" w:w="100"/>
+            </w:tcMar>
+          </w:tcPr>
+          <w:p>
+            <w:pPr>
+              <w:spacing w:after="0" w:line="252"/>
+            </w:pPr>
+            <w:r>
+              <w:rPr>
+                <w:b w:val="false"/>
+                <w:bCs w:val="false"/>
+                <w:sz w:val="19"/>
+                <w:szCs w:val="19"/>
+              </w:rPr>
+              <w:t xml:space="preserve">Data: silica glasses, defect detectors, stability checks</w:t>
+            </w:r>
+          </w:p>
+        </w:tc>
+        <w:tc>
+          <w:tcPr>
+            <w:tcW w:type="dxa" w:w="1200"/>
+            <w:tcBorders>
+              <w:top w:val="single" w:color="BFBFBF" w:sz="4"/>
+              <w:left w:val="single" w:color="BFBFBF" w:sz="4"/>
+              <w:bottom w:val="single" w:color="BFBFBF" w:sz="4"/>
+              <w:right w:val="single" w:color="BFBFBF" w:sz="4"/>
+            </w:tcBorders>
+            <w:tcMar>
+              <w:top w:type="dxa" w:w="60"/>
+              <w:left w:type="dxa" w:w="100"/>
+              <w:bottom w:type="dxa" w:w="60"/>
+              <w:right w:type="dxa" w:w="100"/>
+            </w:tcMar>
+          </w:tcPr>
+          <w:p>
+            <w:pPr>
+              <w:spacing w:after="0" w:line="252"/>
+              <w:jc w:val="center"/>
+            </w:pPr>
+            <w:r>
+              <w:rPr>
+                <w:b w:val="false"/>
+                <w:bCs w:val="false"/>
+                <w:sz w:val="19"/>
+                <w:szCs w:val="19"/>
+              </w:rPr>
+              <w:t xml:space="preserve">0</w:t>
+            </w:r>
+          </w:p>
+        </w:tc>
+        <w:tc>
+          <w:tcPr>
+            <w:tcW w:type="dxa" w:w="1200"/>
+            <w:tcBorders>
+              <w:top w:val="single" w:color="BFBFBF" w:sz="4"/>
+              <w:left w:val="single" w:color="BFBFBF" w:sz="4"/>
+              <w:bottom w:val="single" w:color="BFBFBF" w:sz="4"/>
+              <w:right w:val="single" w:color="BFBFBF" w:sz="4"/>
+            </w:tcBorders>
+            <w:tcMar>
+              <w:top w:type="dxa" w:w="60"/>
+              <w:left w:type="dxa" w:w="100"/>
+              <w:bottom w:type="dxa" w:w="60"/>
+              <w:right w:type="dxa" w:w="100"/>
+            </w:tcMar>
+          </w:tcPr>
+          <w:p>
+            <w:pPr>
+              <w:spacing w:after="0" w:line="252"/>
+              <w:jc w:val="center"/>
+            </w:pPr>
+            <w:r>
+              <w:rPr>
+                <w:b w:val="false"/>
+                <w:bCs w:val="false"/>
+                <w:sz w:val="19"/>
+                <w:szCs w:val="19"/>
+              </w:rPr>
+              <w:t xml:space="preserve">882</w:t>
+            </w:r>
+          </w:p>
+        </w:tc>
+        <w:tc>
+          <w:tcPr>
+            <w:tcW w:type="dxa" w:w="1400"/>
+            <w:tcBorders>
+              <w:top w:val="single" w:color="BFBFBF" w:sz="4"/>
+              <w:left w:val="single" w:color="BFBFBF" w:sz="4"/>
+              <w:bottom w:val="single" w:color="BFBFBF" w:sz="4"/>
+              <w:right w:val="single" w:color="BFBFBF" w:sz="4"/>
+            </w:tcBorders>
+            <w:tcMar>
+              <w:top w:type="dxa" w:w="60"/>
+              <w:left w:type="dxa" w:w="100"/>
+              <w:bottom w:type="dxa" w:w="60"/>
+              <w:right w:type="dxa" w:w="100"/>
+            </w:tcMar>
+          </w:tcPr>
+          <w:p>
+            <w:pPr>
+              <w:spacing w:after="0" w:line="252"/>
+              <w:jc w:val="center"/>
+            </w:pPr>
+            <w:r>
+              <w:rPr>
+                <w:b w:val="false"/>
+                <w:bCs w:val="false"/>
+                <w:sz w:val="19"/>
+                <w:szCs w:val="19"/>
+              </w:rPr>
+              <w:t xml:space="preserve">882</w:t>
+            </w:r>
+          </w:p>
+        </w:tc>
+      </w:tr>
+      <w:tr>
+        <w:tc>
+          <w:tcPr>
+            <w:tcW w:type="dxa" w:w="900"/>
+            <w:tcBorders>
+              <w:top w:val="single" w:color="BFBFBF" w:sz="4"/>
+              <w:left w:val="single" w:color="BFBFBF" w:sz="4"/>
+              <w:bottom w:val="single" w:color="BFBFBF" w:sz="4"/>
+              <w:right w:val="single" w:color="BFBFBF" w:sz="4"/>
+            </w:tcBorders>
+            <w:tcMar>
+              <w:top w:type="dxa" w:w="60"/>
+              <w:left w:type="dxa" w:w="100"/>
+              <w:bottom w:type="dxa" w:w="60"/>
+              <w:right w:type="dxa" w:w="100"/>
+            </w:tcMar>
+          </w:tcPr>
+          <w:p>
+            <w:pPr>
+              <w:spacing w:after="0" w:line="252"/>
+              <w:jc w:val="center"/>
+            </w:pPr>
+            <w:r>
+              <w:rPr>
+                <w:b w:val="false"/>
+                <w:bCs w:val="false"/>
+                <w:sz w:val="19"/>
+                <w:szCs w:val="19"/>
+              </w:rPr>
+              <w:t xml:space="preserve">4–8</w:t>
+            </w:r>
+          </w:p>
+        </w:tc>
+        <w:tc>
+          <w:tcPr>
+            <w:tcW w:type="dxa" w:w="4660"/>
+            <w:tcBorders>
+              <w:top w:val="single" w:color="BFBFBF" w:sz="4"/>
+              <w:left w:val="single" w:color="BFBFBF" w:sz="4"/>
+              <w:bottom w:val="single" w:color="BFBFBF" w:sz="4"/>
+              <w:right w:val="single" w:color="BFBFBF" w:sz="4"/>
+            </w:tcBorders>
+            <w:tcMar>
+              <w:top w:type="dxa" w:w="60"/>
+              <w:left w:type="dxa" w:w="100"/>
+              <w:bottom w:type="dxa" w:w="60"/>
+              <w:right w:type="dxa" w:w="100"/>
+            </w:tcMar>
+          </w:tcPr>
+          <w:p>
+            <w:pPr>
+              <w:spacing w:after="0" w:line="252"/>
+            </w:pPr>
+            <w:r>
+              <w:rPr>
+                <w:b w:val="false"/>
+                <w:bCs w:val="false"/>
+                <w:sz w:val="19"/>
+                <w:szCs w:val="19"/>
+              </w:rPr>
+              <w:t xml:space="preserve">Model: 64 trial runs, top 6, sampling-step tuning</w:t>
+            </w:r>
+          </w:p>
+        </w:tc>
+        <w:tc>
+          <w:tcPr>
+            <w:tcW w:type="dxa" w:w="1200"/>
+            <w:tcBorders>
+              <w:top w:val="single" w:color="BFBFBF" w:sz="4"/>
+              <w:left w:val="single" w:color="BFBFBF" w:sz="4"/>
+              <w:bottom w:val="single" w:color="BFBFBF" w:sz="4"/>
+              <w:right w:val="single" w:color="BFBFBF" w:sz="4"/>
+            </w:tcBorders>
+            <w:tcMar>
+              <w:top w:type="dxa" w:w="60"/>
+              <w:left w:type="dxa" w:w="100"/>
+              <w:bottom w:type="dxa" w:w="60"/>
+              <w:right w:type="dxa" w:w="100"/>
+            </w:tcMar>
+          </w:tcPr>
+          <w:p>
+            <w:pPr>
+              <w:spacing w:after="0" w:line="252"/>
+              <w:jc w:val="center"/>
+            </w:pPr>
+            <w:r>
+              <w:rPr>
+                <w:b w:val="false"/>
+                <w:bCs w:val="false"/>
+                <w:sz w:val="19"/>
+                <w:szCs w:val="19"/>
+              </w:rPr>
+              <w:t xml:space="preserve">156</w:t>
+            </w:r>
+          </w:p>
+        </w:tc>
+        <w:tc>
+          <w:tcPr>
+            <w:tcW w:type="dxa" w:w="1200"/>
+            <w:tcBorders>
+              <w:top w:val="single" w:color="BFBFBF" w:sz="4"/>
+              <w:left w:val="single" w:color="BFBFBF" w:sz="4"/>
+              <w:bottom w:val="single" w:color="BFBFBF" w:sz="4"/>
+              <w:right w:val="single" w:color="BFBFBF" w:sz="4"/>
+            </w:tcBorders>
+            <w:tcMar>
+              <w:top w:type="dxa" w:w="60"/>
+              <w:left w:type="dxa" w:w="100"/>
+              <w:bottom w:type="dxa" w:w="60"/>
+              <w:right w:type="dxa" w:w="100"/>
+            </w:tcMar>
+          </w:tcPr>
+          <w:p>
+            <w:pPr>
+              <w:spacing w:after="0" w:line="252"/>
+              <w:jc w:val="center"/>
+            </w:pPr>
+            <w:r>
+              <w:rPr>
+                <w:b w:val="false"/>
+                <w:bCs w:val="false"/>
+                <w:sz w:val="19"/>
+                <w:szCs w:val="19"/>
+              </w:rPr>
+              <w:t xml:space="preserve">0</w:t>
+            </w:r>
+          </w:p>
+        </w:tc>
+        <w:tc>
+          <w:tcPr>
+            <w:tcW w:type="dxa" w:w="1400"/>
+            <w:tcBorders>
+              <w:top w:val="single" w:color="BFBFBF" w:sz="4"/>
+              <w:left w:val="single" w:color="BFBFBF" w:sz="4"/>
+              <w:bottom w:val="single" w:color="BFBFBF" w:sz="4"/>
+              <w:right w:val="single" w:color="BFBFBF" w:sz="4"/>
+            </w:tcBorders>
+            <w:tcMar>
+              <w:top w:type="dxa" w:w="60"/>
+              <w:left w:type="dxa" w:w="100"/>
+              <w:bottom w:type="dxa" w:w="60"/>
+              <w:right w:type="dxa" w:w="100"/>
+            </w:tcMar>
+          </w:tcPr>
+          <w:p>
+            <w:pPr>
+              <w:spacing w:after="0" w:line="252"/>
+              <w:jc w:val="center"/>
+            </w:pPr>
+            <w:r>
+              <w:rPr>
+                <w:b w:val="false"/>
+                <w:bCs w:val="false"/>
+                <w:sz w:val="19"/>
+                <w:szCs w:val="19"/>
+              </w:rPr>
+              <w:t xml:space="preserve">8,406</w:t>
+            </w:r>
+          </w:p>
+        </w:tc>
+      </w:tr>
+      <w:tr>
+        <w:tc>
+          <w:tcPr>
+            <w:tcW w:type="dxa" w:w="900"/>
+            <w:tcBorders>
+              <w:top w:val="single" w:color="BFBFBF" w:sz="4"/>
+              <w:left w:val="single" w:color="BFBFBF" w:sz="4"/>
+              <w:bottom w:val="single" w:color="BFBFBF" w:sz="4"/>
+              <w:right w:val="single" w:color="BFBFBF" w:sz="4"/>
+            </w:tcBorders>
+            <w:tcMar>
+              <w:top w:type="dxa" w:w="60"/>
+              <w:left w:type="dxa" w:w="100"/>
+              <w:bottom w:type="dxa" w:w="60"/>
+              <w:right w:type="dxa" w:w="100"/>
+            </w:tcMar>
+          </w:tcPr>
+          <w:p>
+            <w:pPr>
+              <w:spacing w:after="0" w:line="252"/>
+              <w:jc w:val="center"/>
+            </w:pPr>
+            <w:r>
+              <w:rPr>
+                <w:b w:val="false"/>
+                <w:bCs w:val="false"/>
+                <w:sz w:val="19"/>
+                <w:szCs w:val="19"/>
+              </w:rPr>
+              <w:t xml:space="preserve">7–11</w:t>
+            </w:r>
+          </w:p>
+        </w:tc>
+        <w:tc>
+          <w:tcPr>
+            <w:tcW w:type="dxa" w:w="4660"/>
+            <w:tcBorders>
+              <w:top w:val="single" w:color="BFBFBF" w:sz="4"/>
+              <w:left w:val="single" w:color="BFBFBF" w:sz="4"/>
+              <w:bottom w:val="single" w:color="BFBFBF" w:sz="4"/>
+              <w:right w:val="single" w:color="BFBFBF" w:sz="4"/>
+            </w:tcBorders>
+            <w:tcMar>
+              <w:top w:type="dxa" w:w="60"/>
+              <w:left w:type="dxa" w:w="100"/>
+              <w:bottom w:type="dxa" w:w="60"/>
+              <w:right w:type="dxa" w:w="100"/>
+            </w:tcMar>
+          </w:tcPr>
+          <w:p>
+            <w:pPr>
+              <w:spacing w:after="0" w:line="252"/>
+            </w:pPr>
+            <w:r>
+              <w:rPr>
+                <w:b w:val="false"/>
+                <w:bCs w:val="false"/>
+                <w:sz w:val="19"/>
+                <w:szCs w:val="19"/>
+              </w:rPr>
+              <w:t xml:space="preserve">Main results: full runs, seeds, all sampling, comparison methods</w:t>
+            </w:r>
+          </w:p>
+        </w:tc>
+        <w:tc>
+          <w:tcPr>
+            <w:tcW w:type="dxa" w:w="1200"/>
+            <w:tcBorders>
+              <w:top w:val="single" w:color="BFBFBF" w:sz="4"/>
+              <w:left w:val="single" w:color="BFBFBF" w:sz="4"/>
+              <w:bottom w:val="single" w:color="BFBFBF" w:sz="4"/>
+              <w:right w:val="single" w:color="BFBFBF" w:sz="4"/>
+            </w:tcBorders>
+            <w:tcMar>
+              <w:top w:type="dxa" w:w="60"/>
+              <w:left w:type="dxa" w:w="100"/>
+              <w:bottom w:type="dxa" w:w="60"/>
+              <w:right w:type="dxa" w:w="100"/>
+            </w:tcMar>
+          </w:tcPr>
+          <w:p>
+            <w:pPr>
+              <w:spacing w:after="0" w:line="252"/>
+              <w:jc w:val="center"/>
+            </w:pPr>
+            <w:r>
+              <w:rPr>
+                <w:b w:val="false"/>
+                <w:bCs w:val="false"/>
+                <w:sz w:val="19"/>
+                <w:szCs w:val="19"/>
+              </w:rPr>
+              <w:t xml:space="preserve">429</w:t>
+            </w:r>
+          </w:p>
+        </w:tc>
+        <w:tc>
+          <w:tcPr>
+            <w:tcW w:type="dxa" w:w="1200"/>
+            <w:tcBorders>
+              <w:top w:val="single" w:color="BFBFBF" w:sz="4"/>
+              <w:left w:val="single" w:color="BFBFBF" w:sz="4"/>
+              <w:bottom w:val="single" w:color="BFBFBF" w:sz="4"/>
+              <w:right w:val="single" w:color="BFBFBF" w:sz="4"/>
+            </w:tcBorders>
+            <w:tcMar>
+              <w:top w:type="dxa" w:w="60"/>
+              <w:left w:type="dxa" w:w="100"/>
+              <w:bottom w:type="dxa" w:w="60"/>
+              <w:right w:type="dxa" w:w="100"/>
+            </w:tcMar>
+          </w:tcPr>
+          <w:p>
+            <w:pPr>
+              <w:spacing w:after="0" w:line="252"/>
+              <w:jc w:val="center"/>
+            </w:pPr>
+            <w:r>
+              <w:rPr>
+                <w:b w:val="false"/>
+                <w:bCs w:val="false"/>
+                <w:sz w:val="19"/>
+                <w:szCs w:val="19"/>
+              </w:rPr>
+              <w:t xml:space="preserve">799</w:t>
+            </w:r>
+          </w:p>
+        </w:tc>
+        <w:tc>
+          <w:tcPr>
+            <w:tcW w:type="dxa" w:w="1400"/>
+            <w:tcBorders>
+              <w:top w:val="single" w:color="BFBFBF" w:sz="4"/>
+              <w:left w:val="single" w:color="BFBFBF" w:sz="4"/>
+              <w:bottom w:val="single" w:color="BFBFBF" w:sz="4"/>
+              <w:right w:val="single" w:color="BFBFBF" w:sz="4"/>
+            </w:tcBorders>
+            <w:tcMar>
+              <w:top w:type="dxa" w:w="60"/>
+              <w:left w:type="dxa" w:w="100"/>
+              <w:bottom w:type="dxa" w:w="60"/>
+              <w:right w:type="dxa" w:w="100"/>
+            </w:tcMar>
+          </w:tcPr>
+          <w:p>
+            <w:pPr>
+              <w:spacing w:after="0" w:line="252"/>
+              <w:jc w:val="center"/>
+            </w:pPr>
+            <w:r>
+              <w:rPr>
+                <w:b w:val="false"/>
+                <w:bCs w:val="false"/>
+                <w:sz w:val="19"/>
+                <w:szCs w:val="19"/>
+              </w:rPr>
+              <w:t xml:space="preserve">23,990</w:t>
+            </w:r>
+          </w:p>
+        </w:tc>
+      </w:tr>
+      <w:tr>
+        <w:tc>
+          <w:tcPr>
+            <w:tcW w:type="dxa" w:w="900"/>
+            <w:tcBorders>
+              <w:top w:val="single" w:color="BFBFBF" w:sz="4"/>
+              <w:left w:val="single" w:color="BFBFBF" w:sz="4"/>
+              <w:bottom w:val="single" w:color="BFBFBF" w:sz="4"/>
+              <w:right w:val="single" w:color="BFBFBF" w:sz="4"/>
+            </w:tcBorders>
+            <w:tcMar>
+              <w:top w:type="dxa" w:w="60"/>
+              <w:left w:type="dxa" w:w="100"/>
+              <w:bottom w:type="dxa" w:w="60"/>
+              <w:right w:type="dxa" w:w="100"/>
+            </w:tcMar>
+          </w:tcPr>
+          <w:p>
+            <w:pPr>
+              <w:spacing w:after="0" w:line="252"/>
+              <w:jc w:val="center"/>
+            </w:pPr>
+            <w:r>
+              <w:rPr>
+                <w:b w:val="false"/>
+                <w:bCs w:val="false"/>
+                <w:sz w:val="19"/>
+                <w:szCs w:val="19"/>
+              </w:rPr>
+              <w:t xml:space="preserve">10–13</w:t>
+            </w:r>
+          </w:p>
+        </w:tc>
+        <w:tc>
+          <w:tcPr>
+            <w:tcW w:type="dxa" w:w="4660"/>
+            <w:tcBorders>
+              <w:top w:val="single" w:color="BFBFBF" w:sz="4"/>
+              <w:left w:val="single" w:color="BFBFBF" w:sz="4"/>
+              <w:bottom w:val="single" w:color="BFBFBF" w:sz="4"/>
+              <w:right w:val="single" w:color="BFBFBF" w:sz="4"/>
+            </w:tcBorders>
+            <w:tcMar>
+              <w:top w:type="dxa" w:w="60"/>
+              <w:left w:type="dxa" w:w="100"/>
+              <w:bottom w:type="dxa" w:w="60"/>
+              <w:right w:type="dxa" w:w="100"/>
+            </w:tcMar>
+          </w:tcPr>
+          <w:p>
+            <w:pPr>
+              <w:spacing w:after="0" w:line="252"/>
+            </w:pPr>
+            <w:r>
+              <w:rPr>
+                <w:b w:val="false"/>
+                <w:bCs w:val="false"/>
+                <w:sz w:val="19"/>
+                <w:szCs w:val="19"/>
+              </w:rPr>
+              <w:t xml:space="preserve">Physics checks, energy barriers, DFT</w:t>
+            </w:r>
+          </w:p>
+        </w:tc>
+        <w:tc>
+          <w:tcPr>
+            <w:tcW w:type="dxa" w:w="1200"/>
+            <w:tcBorders>
+              <w:top w:val="single" w:color="BFBFBF" w:sz="4"/>
+              <w:left w:val="single" w:color="BFBFBF" w:sz="4"/>
+              <w:bottom w:val="single" w:color="BFBFBF" w:sz="4"/>
+              <w:right w:val="single" w:color="BFBFBF" w:sz="4"/>
+            </w:tcBorders>
+            <w:tcMar>
+              <w:top w:type="dxa" w:w="60"/>
+              <w:left w:type="dxa" w:w="100"/>
+              <w:bottom w:type="dxa" w:w="60"/>
+              <w:right w:type="dxa" w:w="100"/>
+            </w:tcMar>
+          </w:tcPr>
+          <w:p>
+            <w:pPr>
+              <w:spacing w:after="0" w:line="252"/>
+              <w:jc w:val="center"/>
+            </w:pPr>
+            <w:r>
+              <w:rPr>
+                <w:b w:val="false"/>
+                <w:bCs w:val="false"/>
+                <w:sz w:val="19"/>
+                <w:szCs w:val="19"/>
+              </w:rPr>
+              <w:t xml:space="preserve">24</w:t>
+            </w:r>
+          </w:p>
+        </w:tc>
+        <w:tc>
+          <w:tcPr>
+            <w:tcW w:type="dxa" w:w="1200"/>
+            <w:tcBorders>
+              <w:top w:val="single" w:color="BFBFBF" w:sz="4"/>
+              <w:left w:val="single" w:color="BFBFBF" w:sz="4"/>
+              <w:bottom w:val="single" w:color="BFBFBF" w:sz="4"/>
+              <w:right w:val="single" w:color="BFBFBF" w:sz="4"/>
+            </w:tcBorders>
+            <w:tcMar>
+              <w:top w:type="dxa" w:w="60"/>
+              <w:left w:type="dxa" w:w="100"/>
+              <w:bottom w:type="dxa" w:w="60"/>
+              <w:right w:type="dxa" w:w="100"/>
+            </w:tcMar>
+          </w:tcPr>
+          <w:p>
+            <w:pPr>
+              <w:spacing w:after="0" w:line="252"/>
+              <w:jc w:val="center"/>
+            </w:pPr>
+            <w:r>
+              <w:rPr>
+                <w:b w:val="false"/>
+                <w:bCs w:val="false"/>
+                <w:sz w:val="19"/>
+                <w:szCs w:val="19"/>
+              </w:rPr>
+              <w:t xml:space="preserve">5,180</w:t>
+            </w:r>
+          </w:p>
+        </w:tc>
+        <w:tc>
+          <w:tcPr>
+            <w:tcW w:type="dxa" w:w="1400"/>
+            <w:tcBorders>
+              <w:top w:val="single" w:color="BFBFBF" w:sz="4"/>
+              <w:left w:val="single" w:color="BFBFBF" w:sz="4"/>
+              <w:bottom w:val="single" w:color="BFBFBF" w:sz="4"/>
+              <w:right w:val="single" w:color="BFBFBF" w:sz="4"/>
+            </w:tcBorders>
+            <w:tcMar>
+              <w:top w:type="dxa" w:w="60"/>
+              <w:left w:type="dxa" w:w="100"/>
+              <w:bottom w:type="dxa" w:w="60"/>
+              <w:right w:type="dxa" w:w="100"/>
+            </w:tcMar>
+          </w:tcPr>
+          <w:p>
+            <w:pPr>
+              <w:spacing w:after="0" w:line="252"/>
+              <w:jc w:val="center"/>
+            </w:pPr>
+            <w:r>
+              <w:rPr>
+                <w:b w:val="false"/>
+                <w:bCs w:val="false"/>
+                <w:sz w:val="19"/>
+                <w:szCs w:val="19"/>
+              </w:rPr>
+              <w:t xml:space="preserve">6,477</w:t>
+            </w:r>
+          </w:p>
+        </w:tc>
+      </w:tr>
+      <w:tr>
+        <w:tc>
+          <w:tcPr>
+            <w:tcW w:type="dxa" w:w="900"/>
+            <w:tcBorders>
+              <w:top w:val="single" w:color="BFBFBF" w:sz="4"/>
+              <w:left w:val="single" w:color="BFBFBF" w:sz="4"/>
+              <w:bottom w:val="single" w:color="BFBFBF" w:sz="4"/>
+              <w:right w:val="single" w:color="BFBFBF" w:sz="4"/>
+            </w:tcBorders>
+            <w:tcMar>
+              <w:top w:type="dxa" w:w="60"/>
+              <w:left w:type="dxa" w:w="100"/>
+              <w:bottom w:type="dxa" w:w="60"/>
+              <w:right w:type="dxa" w:w="100"/>
+            </w:tcMar>
+          </w:tcPr>
+          <w:p>
+            <w:pPr>
+              <w:spacing w:after="0" w:line="252"/>
+              <w:jc w:val="center"/>
+            </w:pPr>
+            <w:r>
+              <w:rPr>
+                <w:b w:val="false"/>
+                <w:bCs w:val="false"/>
+                <w:sz w:val="19"/>
+                <w:szCs w:val="19"/>
+              </w:rPr>
+              <w:t xml:space="preserve">12–16</w:t>
+            </w:r>
+          </w:p>
+        </w:tc>
+        <w:tc>
+          <w:tcPr>
+            <w:tcW w:type="dxa" w:w="4660"/>
+            <w:tcBorders>
+              <w:top w:val="single" w:color="BFBFBF" w:sz="4"/>
+              <w:left w:val="single" w:color="BFBFBF" w:sz="4"/>
+              <w:bottom w:val="single" w:color="BFBFBF" w:sz="4"/>
+              <w:right w:val="single" w:color="BFBFBF" w:sz="4"/>
+            </w:tcBorders>
+            <w:tcMar>
+              <w:top w:type="dxa" w:w="60"/>
+              <w:left w:type="dxa" w:w="100"/>
+              <w:bottom w:type="dxa" w:w="60"/>
+              <w:right w:type="dxa" w:w="100"/>
+            </w:tcMar>
+          </w:tcPr>
+          <w:p>
+            <w:pPr>
+              <w:spacing w:after="0" w:line="252"/>
+            </w:pPr>
+            <w:r>
+              <w:rPr>
+                <w:b w:val="false"/>
+                <w:bCs w:val="false"/>
+                <w:sz w:val="19"/>
+                <w:szCs w:val="19"/>
+              </w:rPr>
+              <w:t xml:space="preserve">Paper: figures, code and data release</w:t>
+            </w:r>
+          </w:p>
+        </w:tc>
+        <w:tc>
+          <w:tcPr>
+            <w:tcW w:type="dxa" w:w="1200"/>
+            <w:tcBorders>
+              <w:top w:val="single" w:color="BFBFBF" w:sz="4"/>
+              <w:left w:val="single" w:color="BFBFBF" w:sz="4"/>
+              <w:bottom w:val="single" w:color="BFBFBF" w:sz="4"/>
+              <w:right w:val="single" w:color="BFBFBF" w:sz="4"/>
+            </w:tcBorders>
+            <w:tcMar>
+              <w:top w:type="dxa" w:w="60"/>
+              <w:left w:type="dxa" w:w="100"/>
+              <w:bottom w:type="dxa" w:w="60"/>
+              <w:right w:type="dxa" w:w="100"/>
+            </w:tcMar>
+          </w:tcPr>
+          <w:p>
+            <w:pPr>
+              <w:spacing w:after="0" w:line="252"/>
+              <w:jc w:val="center"/>
+            </w:pPr>
+            <w:r>
+              <w:rPr>
+                <w:b w:val="false"/>
+                <w:bCs w:val="false"/>
+                <w:sz w:val="19"/>
+                <w:szCs w:val="19"/>
+              </w:rPr>
+              <w:t xml:space="preserve">0</w:t>
+            </w:r>
+          </w:p>
+        </w:tc>
+        <w:tc>
+          <w:tcPr>
+            <w:tcW w:type="dxa" w:w="1200"/>
+            <w:tcBorders>
+              <w:top w:val="single" w:color="BFBFBF" w:sz="4"/>
+              <w:left w:val="single" w:color="BFBFBF" w:sz="4"/>
+              <w:bottom w:val="single" w:color="BFBFBF" w:sz="4"/>
+              <w:right w:val="single" w:color="BFBFBF" w:sz="4"/>
+            </w:tcBorders>
+            <w:tcMar>
+              <w:top w:type="dxa" w:w="60"/>
+              <w:left w:type="dxa" w:w="100"/>
+              <w:bottom w:type="dxa" w:w="60"/>
+              <w:right w:type="dxa" w:w="100"/>
+            </w:tcMar>
+          </w:tcPr>
+          <w:p>
+            <w:pPr>
+              <w:spacing w:after="0" w:line="252"/>
+              <w:jc w:val="center"/>
+            </w:pPr>
+            <w:r>
+              <w:rPr>
+                <w:b w:val="false"/>
+                <w:bCs w:val="false"/>
+                <w:sz w:val="19"/>
+                <w:szCs w:val="19"/>
+              </w:rPr>
+              <w:t xml:space="preserve">0</w:t>
+            </w:r>
+          </w:p>
+        </w:tc>
+        <w:tc>
+          <w:tcPr>
+            <w:tcW w:type="dxa" w:w="1400"/>
+            <w:tcBorders>
+              <w:top w:val="single" w:color="BFBFBF" w:sz="4"/>
+              <w:left w:val="single" w:color="BFBFBF" w:sz="4"/>
+              <w:bottom w:val="single" w:color="BFBFBF" w:sz="4"/>
+              <w:right w:val="single" w:color="BFBFBF" w:sz="4"/>
+            </w:tcBorders>
+            <w:tcMar>
+              <w:top w:type="dxa" w:w="60"/>
+              <w:left w:type="dxa" w:w="100"/>
+              <w:bottom w:type="dxa" w:w="60"/>
+              <w:right w:type="dxa" w:w="100"/>
+            </w:tcMar>
+          </w:tcPr>
+          <w:p>
+            <w:pPr>
+              <w:spacing w:after="0" w:line="252"/>
+              <w:jc w:val="center"/>
+            </w:pPr>
+            <w:r>
+              <w:rPr>
+                <w:b w:val="false"/>
+                <w:bCs w:val="false"/>
+                <w:sz w:val="19"/>
+                <w:szCs w:val="19"/>
+              </w:rPr>
+              <w:t xml:space="preserve">0</w:t>
+            </w:r>
+          </w:p>
+        </w:tc>
+      </w:tr>
+      <w:tr>
+        <w:tc>
+          <w:tcPr>
+            <w:tcW w:type="dxa" w:w="900"/>
+            <w:tcBorders>
+              <w:top w:val="single" w:color="BFBFBF" w:sz="4"/>
+              <w:left w:val="single" w:color="BFBFBF" w:sz="4"/>
+              <w:bottom w:val="single" w:color="BFBFBF" w:sz="4"/>
+              <w:right w:val="single" w:color="BFBFBF" w:sz="4"/>
+            </w:tcBorders>
+            <w:shd w:fill="EAF2FB" w:color="auto" w:val="clear"/>
+            <w:tcMar>
+              <w:top w:type="dxa" w:w="60"/>
+              <w:left w:type="dxa" w:w="100"/>
+              <w:bottom w:type="dxa" w:w="60"/>
+              <w:right w:type="dxa" w:w="100"/>
+            </w:tcMar>
+          </w:tcPr>
+          <w:p>
+            <w:pPr>
+              <w:spacing w:after="0" w:line="252"/>
+              <w:jc w:val="center"/>
+            </w:pPr>
+            <w:r>
+              <w:rPr>
+                <w:b w:val="false"/>
+                <w:bCs w:val="false"/>
+                <w:sz w:val="19"/>
+                <w:szCs w:val="19"/>
+              </w:rPr>
+              <w:t xml:space="preserve"/>
+            </w:r>
+          </w:p>
+        </w:tc>
+        <w:tc>
+          <w:tcPr>
+            <w:tcW w:type="dxa" w:w="4660"/>
+            <w:tcBorders>
+              <w:top w:val="single" w:color="BFBFBF" w:sz="4"/>
+              <w:left w:val="single" w:color="BFBFBF" w:sz="4"/>
+              <w:bottom w:val="single" w:color="BFBFBF" w:sz="4"/>
+              <w:right w:val="single" w:color="BFBFBF" w:sz="4"/>
+            </w:tcBorders>
+            <w:shd w:fill="EAF2FB" w:color="auto" w:val="clear"/>
+            <w:tcMar>
+              <w:top w:type="dxa" w:w="60"/>
+              <w:left w:type="dxa" w:w="100"/>
+              <w:bottom w:type="dxa" w:w="60"/>
+              <w:right w:type="dxa" w:w="100"/>
+            </w:tcMar>
+          </w:tcPr>
+          <w:p>
+            <w:pPr>
+              <w:spacing w:after="0" w:line="252"/>
+            </w:pPr>
+            <w:r>
+              <w:rPr>
+                <w:b w:val="false"/>
+                <w:bCs w:val="false"/>
+                <w:sz w:val="19"/>
+                <w:szCs w:val="19"/>
+              </w:rPr>
+              <w:t xml:space="preserve">Total (+ 10,000 for storage)</w:t>
+            </w:r>
+          </w:p>
+        </w:tc>
+        <w:tc>
+          <w:tcPr>
+            <w:tcW w:type="dxa" w:w="1200"/>
+            <w:tcBorders>
+              <w:top w:val="single" w:color="BFBFBF" w:sz="4"/>
+              <w:left w:val="single" w:color="BFBFBF" w:sz="4"/>
+              <w:bottom w:val="single" w:color="BFBFBF" w:sz="4"/>
+              <w:right w:val="single" w:color="BFBFBF" w:sz="4"/>
+            </w:tcBorders>
+            <w:shd w:fill="EAF2FB" w:color="auto" w:val="clear"/>
+            <w:tcMar>
+              <w:top w:type="dxa" w:w="60"/>
+              <w:left w:type="dxa" w:w="100"/>
+              <w:bottom w:type="dxa" w:w="60"/>
+              <w:right w:type="dxa" w:w="100"/>
+            </w:tcMar>
+          </w:tcPr>
+          <w:p>
+            <w:pPr>
+              <w:spacing w:after="0" w:line="252"/>
+              <w:jc w:val="center"/>
+            </w:pPr>
+            <w:r>
+              <w:rPr>
+                <w:b w:val="false"/>
+                <w:bCs w:val="false"/>
+                <w:sz w:val="19"/>
+                <w:szCs w:val="19"/>
+              </w:rPr>
+              <w:t xml:space="preserve">653</w:t>
+            </w:r>
+          </w:p>
+        </w:tc>
+        <w:tc>
+          <w:tcPr>
+            <w:tcW w:type="dxa" w:w="1200"/>
+            <w:tcBorders>
+              <w:top w:val="single" w:color="BFBFBF" w:sz="4"/>
+              <w:left w:val="single" w:color="BFBFBF" w:sz="4"/>
+              <w:bottom w:val="single" w:color="BFBFBF" w:sz="4"/>
+              <w:right w:val="single" w:color="BFBFBF" w:sz="4"/>
+            </w:tcBorders>
+            <w:shd w:fill="EAF2FB" w:color="auto" w:val="clear"/>
+            <w:tcMar>
+              <w:top w:type="dxa" w:w="60"/>
+              <w:left w:type="dxa" w:w="100"/>
+              <w:bottom w:type="dxa" w:w="60"/>
+              <w:right w:type="dxa" w:w="100"/>
+            </w:tcMar>
+          </w:tcPr>
+          <w:p>
+            <w:pPr>
+              <w:spacing w:after="0" w:line="252"/>
+              <w:jc w:val="center"/>
+            </w:pPr>
+            <w:r>
+              <w:rPr>
+                <w:b w:val="false"/>
+                <w:bCs w:val="false"/>
+                <w:sz w:val="19"/>
+                <w:szCs w:val="19"/>
+              </w:rPr>
+              <w:t xml:space="preserve">6,861</w:t>
+            </w:r>
+          </w:p>
+        </w:tc>
+        <w:tc>
+          <w:tcPr>
+            <w:tcW w:type="dxa" w:w="1400"/>
+            <w:tcBorders>
+              <w:top w:val="single" w:color="BFBFBF" w:sz="4"/>
+              <w:left w:val="single" w:color="BFBFBF" w:sz="4"/>
+              <w:bottom w:val="single" w:color="BFBFBF" w:sz="4"/>
+              <w:right w:val="single" w:color="BFBFBF" w:sz="4"/>
+            </w:tcBorders>
+            <w:shd w:fill="EAF2FB" w:color="auto" w:val="clear"/>
+            <w:tcMar>
+              <w:top w:type="dxa" w:w="60"/>
+              <w:left w:type="dxa" w:w="100"/>
+              <w:bottom w:type="dxa" w:w="60"/>
+              <w:right w:type="dxa" w:w="100"/>
+            </w:tcMar>
+          </w:tcPr>
+          <w:p>
+            <w:pPr>
+              <w:spacing w:after="0" w:line="252"/>
+              <w:jc w:val="center"/>
+            </w:pPr>
+            <w:r>
+              <w:rPr>
+                <w:b w:val="false"/>
+                <w:bCs w:val="false"/>
+                <w:sz w:val="19"/>
+                <w:szCs w:val="19"/>
+              </w:rPr>
+              <w:t xml:space="preserve">52,148</w:t>
+            </w:r>
+          </w:p>
+        </w:tc>
+      </w:tr>
+    </w:tbl>
+    <w:p>
+      <w:pPr>
+        <w:spacing w:after="120" w:before="160"/>
+      </w:pPr>
+      <w:r>
+        <w:t xml:space="preserve">The busiest stage needs 429 GPU-hours in about five weeks: one GPU running 12 hours a day, or 4 GPUs for under five days. The 882 core-hours of the data stage take about 7 hours on one 128-core PSC node.</w:t>
+      </w:r>
+    </w:p>
+    <w:p>
+      <w:pPr>
+        <w:pStyle w:val="Heading2"/>
+      </w:pPr>
+      <w:r>
+        <w:t xml:space="preserve">8.3 Where the epoch times come from</w:t>
       </w:r>
     </w:p>
     <w:tbl>
@@ -10593,7 +11992,7 @@
         <w:spacing w:after="120" w:before="160"/>
       </w:pPr>
       <w:r>
-        <w:t xml:space="preserve">One 3D epoch is one pass over the 600 training glasses (37.5 updates of 16 glasses). A full training run is 50,000 updates, the same as in 2D: 1,333 epochs, or about 17 GPU-hours for NequIP. These are planning numbers; week 1 of the 3D work replaces them with timings on the GPUs we are given.</w:t>
+        <w:t xml:space="preserve">One 3D epoch is one pass over the 600 training glasses (37.5 updates of 16 glasses). A full training run is 50,000 updates, as in 2D: 1,333 epochs, or about 17 GPU-hours for NequIP. Week 1 of the 3D work replaces these planning numbers with timings on the GPUs we are given.</w:t>
       </w:r>
     </w:p>
     <w:p>
@@ -10601,7 +12000,7 @@
         <w:pStyle w:val="Heading2"/>
       </w:pPr>
       <w:r>
-        <w:t xml:space="preserve">8.3 Training the 3D models (base plan)</w:t>
+        <w:t xml:space="preserve">8.4 Training the 3D models</w:t>
       </w:r>
     </w:p>
     <w:p>
@@ -10609,7 +12008,7 @@
         <w:spacing w:after="120" w:line="276"/>
       </w:pPr>
       <w:r>
-        <w:t xml:space="preserve">Like the guide's example (many short runs, then fewer longer ones), we first try 32 variants briefly and keep the best. The 32 variants are every combination of: maximum training noise (2 values), training region size (2), network size (2), number of layers (2) and learning rate (2).</w:t>
+        <w:t xml:space="preserve">Like the guide's example (many short runs, then fewer longer ones), we first try 64 variants briefly and keep the best. The 64 variants are every combination of two values each for: maximum training noise, training region size, network size, number of layers, learning rate and label dropout.</w:t>
       </w:r>
     </w:p>
     <w:tbl>
@@ -10824,7 +12223,7 @@
                 <w:sz w:val="19"/>
                 <w:szCs w:val="19"/>
               </w:rPr>
-              <w:t xml:space="preserve">Short screening runs</w:t>
+              <w:t xml:space="preserve">Short trial runs</w:t>
             </w:r>
           </w:p>
         </w:tc>
@@ -10856,7 +12255,7 @@
                 <w:sz w:val="19"/>
                 <w:szCs w:val="19"/>
               </w:rPr>
-              <w:t xml:space="preserve">32</w:t>
+              <w:t xml:space="preserve">64</w:t>
             </w:r>
           </w:p>
         </w:tc>
@@ -10920,7 +12319,7 @@
                 <w:sz w:val="19"/>
                 <w:szCs w:val="19"/>
               </w:rPr>
-              <w:t xml:space="preserve">4,256</w:t>
+              <w:t xml:space="preserve">8,512</w:t>
             </w:r>
           </w:p>
         </w:tc>
@@ -10952,7 +12351,7 @@
                 <w:sz w:val="19"/>
                 <w:szCs w:val="19"/>
               </w:rPr>
-              <w:t xml:space="preserve">53</w:t>
+              <w:t xml:space="preserve">106</w:t>
             </w:r>
           </w:p>
         </w:tc>
@@ -11729,7 +13128,7 @@
                 <w:sz w:val="19"/>
                 <w:szCs w:val="19"/>
               </w:rPr>
-              <w:t xml:space="preserve">11,723</w:t>
+              <w:t xml:space="preserve">15,979</w:t>
             </w:r>
           </w:p>
         </w:tc>
@@ -11762,7 +13161,7 @@
                 <w:sz w:val="19"/>
                 <w:szCs w:val="19"/>
               </w:rPr>
-              <w:t xml:space="preserve">147</w:t>
+              <w:t xml:space="preserve">200</w:t>
             </w:r>
           </w:p>
         </w:tc>
@@ -11795,7 +13194,7 @@
                 <w:sz w:val="19"/>
                 <w:szCs w:val="19"/>
               </w:rPr>
-              <w:t xml:space="preserve">EGNN-3D: 4 short screening runs</w:t>
+              <w:t xml:space="preserve">EGNN-3D: 4 short trial runs</w:t>
             </w:r>
           </w:p>
         </w:tc>
@@ -12095,7 +13494,7 @@
         <w:pStyle w:val="Heading2"/>
       </w:pPr>
       <w:r>
-        <w:t xml:space="preserve">8.4 Generating and checking samples (base plan)</w:t>
+        <w:t xml:space="preserve">8.5 Generating and checking samples</w:t>
       </w:r>
     </w:p>
     <w:p>
@@ -12103,7 +13502,7 @@
         <w:spacing w:after="120" w:line="276"/>
       </w:pPr>
       <w:r>
-        <w:t xml:space="preserve">Each row is 256 generated samples. Rows with guidance run the network twice per step. The number of sampling steps is not known yet: it is set by the calibration experiment. We assume 1,000 steps (DM2 uses 3,000; our 2D model needed 100). This is the biggest uncertainty: sampling costs 28, 91 or 271 GPU-hours at 300, 1,000 or 3,000 steps.</w:t>
+        <w:t xml:space="preserve">Each row is 256 generated samples. Rows with guidance run the network twice per step. We assume DM2's 3,000 sampling steps; if the tuning experiment picks fewer, sampling drops from 271 to 91 GPU-hours (1,000 steps) or 28 (300 steps).</w:t>
       </w:r>
     </w:p>
     <w:tbl>
@@ -12316,7 +13715,7 @@
                 <w:sz w:val="19"/>
                 <w:szCs w:val="19"/>
               </w:rPr>
-              <w:t xml:space="preserve">40</w:t>
+              <w:t xml:space="preserve">121</w:t>
             </w:r>
           </w:p>
         </w:tc>
@@ -12413,7 +13812,7 @@
                 <w:sz w:val="19"/>
                 <w:szCs w:val="19"/>
               </w:rPr>
-              <w:t xml:space="preserve">20</w:t>
+              <w:t xml:space="preserve">61</w:t>
             </w:r>
           </w:p>
         </w:tc>
@@ -12510,7 +13909,7 @@
                 <w:sz w:val="19"/>
                 <w:szCs w:val="19"/>
               </w:rPr>
-              <w:t xml:space="preserve">13</w:t>
+              <w:t xml:space="preserve">40</w:t>
             </w:r>
           </w:p>
         </w:tc>
@@ -12607,7 +14006,7 @@
                 <w:sz w:val="19"/>
                 <w:szCs w:val="19"/>
               </w:rPr>
-              <w:t xml:space="preserve">10</w:t>
+              <w:t xml:space="preserve">30</w:t>
             </w:r>
           </w:p>
         </w:tc>
@@ -12704,7 +14103,7 @@
                 <w:sz w:val="19"/>
                 <w:szCs w:val="19"/>
               </w:rPr>
-              <w:t xml:space="preserve">6</w:t>
+              <w:t xml:space="preserve">18</w:t>
             </w:r>
           </w:p>
         </w:tc>
@@ -12737,7 +14136,7 @@
                 <w:sz w:val="19"/>
                 <w:szCs w:val="19"/>
               </w:rPr>
-              <w:t xml:space="preserve">Sampling-step calibration</w:t>
+              <w:t xml:space="preserve">Sampling-step tuning</w:t>
             </w:r>
           </w:p>
         </w:tc>
@@ -13001,20 +14400,12 @@
         </w:tc>
       </w:tr>
     </w:tbl>
-    <w:p>
-      <w:pPr>
-        <w:spacing w:after="120" w:before="160"/>
-      </w:pPr>
-      <w:r>
-        <w:t xml:space="preserve">Training plus sampling plus checks comes to 289 GPU-hours; adding 20% for failed runs and surprises gives 347 GPU-hours. The upper estimate (627 GPU-hours) assumes 64 screening variants and 3,000 sampling steps.</w:t>
-      </w:r>
-    </w:p>
     <w:p>
       <w:pPr>
         <w:pStyle w:val="Heading2"/>
       </w:pPr>
       <w:r>
-        <w:t xml:space="preserve">8.5 CPU: simulations and comparison methods</w:t>
+        <w:t xml:space="preserve">8.6 CPU: simulations and comparison methods</w:t>
       </w:r>
     </w:p>
     <w:tbl>
@@ -13372,26 +14763,25 @@
               <w:bottom w:val="single" w:color="BFBFBF" w:sz="4"/>
               <w:right w:val="single" w:color="BFBFBF" w:sz="4"/>
             </w:tcBorders>
-            <w:shd w:fill="EAF2FB" w:color="auto" w:val="clear"/>
-            <w:tcMar>
-              <w:top w:type="dxa" w:w="60"/>
-              <w:left w:type="dxa" w:w="100"/>
-              <w:bottom w:type="dxa" w:w="60"/>
-              <w:right w:type="dxa" w:w="100"/>
-            </w:tcMar>
-          </w:tcPr>
-          <w:p>
-            <w:pPr>
-              <w:spacing w:after="0" w:line="252"/>
-            </w:pPr>
-            <w:r>
-              <w:rPr>
-                <w:b w:val="false"/>
-                <w:bCs w:val="false"/>
-                <w:sz w:val="19"/>
-                <w:szCs w:val="19"/>
-              </w:rPr>
-              <w:t xml:space="preserve">Total</w:t>
+            <w:tcMar>
+              <w:top w:type="dxa" w:w="60"/>
+              <w:left w:type="dxa" w:w="100"/>
+              <w:bottom w:type="dxa" w:w="60"/>
+              <w:right w:type="dxa" w:w="100"/>
+            </w:tcMar>
+          </w:tcPr>
+          <w:p>
+            <w:pPr>
+              <w:spacing w:after="0" w:line="252"/>
+            </w:pPr>
+            <w:r>
+              <w:rPr>
+                <w:b w:val="false"/>
+                <w:bCs w:val="false"/>
+                <w:sz w:val="19"/>
+                <w:szCs w:val="19"/>
+              </w:rPr>
+              <w:t xml:space="preserve">Subtotal × 1.2</w:t>
             </w:r>
           </w:p>
         </w:tc>
@@ -13404,7 +14794,6 @@
               <w:bottom w:val="single" w:color="BFBFBF" w:sz="4"/>
               <w:right w:val="single" w:color="BFBFBF" w:sz="4"/>
             </w:tcBorders>
-            <w:shd w:fill="EAF2FB" w:color="auto" w:val="clear"/>
             <w:tcMar>
               <w:top w:type="dxa" w:w="60"/>
               <w:left w:type="dxa" w:w="100"/>
@@ -13424,7 +14813,7 @@
                 <w:sz w:val="19"/>
                 <w:szCs w:val="19"/>
               </w:rPr>
-              <w:t xml:space="preserve">1,551</w:t>
+              <w:t xml:space="preserve">1,861</w:t>
             </w:r>
           </w:p>
         </w:tc>
@@ -13457,7 +14846,7 @@
                 <w:sz w:val="19"/>
                 <w:szCs w:val="19"/>
               </w:rPr>
-              <w:t xml:space="preserve">Optional quantum (DFT) check</w:t>
+              <w:t xml:space="preserve">Quantum (DFT) check, upper end</w:t>
             </w:r>
           </w:p>
         </w:tc>
@@ -13489,26 +14878,85 @@
                 <w:sz w:val="19"/>
                 <w:szCs w:val="19"/>
               </w:rPr>
-              <w:t xml:space="preserve">2,000–5,000</w:t>
+              <w:t xml:space="preserve">5,000</w:t>
+            </w:r>
+          </w:p>
+        </w:tc>
+      </w:tr>
+      <w:tr>
+        <w:tc>
+          <w:tcPr>
+            <w:tcW w:type="dxa" w:w="6560"/>
+            <w:tcBorders>
+              <w:top w:val="single" w:color="BFBFBF" w:sz="4"/>
+              <w:left w:val="single" w:color="BFBFBF" w:sz="4"/>
+              <w:bottom w:val="single" w:color="BFBFBF" w:sz="4"/>
+              <w:right w:val="single" w:color="BFBFBF" w:sz="4"/>
+            </w:tcBorders>
+            <w:shd w:fill="EAF2FB" w:color="auto" w:val="clear"/>
+            <w:tcMar>
+              <w:top w:type="dxa" w:w="60"/>
+              <w:left w:type="dxa" w:w="100"/>
+              <w:bottom w:type="dxa" w:w="60"/>
+              <w:right w:type="dxa" w:w="100"/>
+            </w:tcMar>
+          </w:tcPr>
+          <w:p>
+            <w:pPr>
+              <w:spacing w:after="0" w:line="252"/>
+            </w:pPr>
+            <w:r>
+              <w:rPr>
+                <w:b w:val="false"/>
+                <w:bCs w:val="false"/>
+                <w:sz w:val="19"/>
+                <w:szCs w:val="19"/>
+              </w:rPr>
+              <w:t xml:space="preserve">Total</w:t>
+            </w:r>
+          </w:p>
+        </w:tc>
+        <w:tc>
+          <w:tcPr>
+            <w:tcW w:type="dxa" w:w="2800"/>
+            <w:tcBorders>
+              <w:top w:val="single" w:color="BFBFBF" w:sz="4"/>
+              <w:left w:val="single" w:color="BFBFBF" w:sz="4"/>
+              <w:bottom w:val="single" w:color="BFBFBF" w:sz="4"/>
+              <w:right w:val="single" w:color="BFBFBF" w:sz="4"/>
+            </w:tcBorders>
+            <w:shd w:fill="EAF2FB" w:color="auto" w:val="clear"/>
+            <w:tcMar>
+              <w:top w:type="dxa" w:w="60"/>
+              <w:left w:type="dxa" w:w="100"/>
+              <w:bottom w:type="dxa" w:w="60"/>
+              <w:right w:type="dxa" w:w="100"/>
+            </w:tcMar>
+          </w:tcPr>
+          <w:p>
+            <w:pPr>
+              <w:spacing w:after="0" w:line="252"/>
+              <w:jc w:val="center"/>
+            </w:pPr>
+            <w:r>
+              <w:rPr>
+                <w:b w:val="false"/>
+                <w:bCs w:val="false"/>
+                <w:sz w:val="19"/>
+                <w:szCs w:val="19"/>
+              </w:rPr>
+              <w:t xml:space="preserve">6,861</w:t>
             </w:r>
           </w:p>
         </w:tc>
       </w:tr>
     </w:tbl>
-    <w:p>
-      <w:pPr>
-        <w:spacing w:after="120" w:before="160"/>
-      </w:pPr>
-      <w:r>
-        <w:t xml:space="preserve">The re-melting comparison can be made about three times cheaper by skipping force calculations between pairs of frozen atoms.</w:t>
-      </w:r>
-    </w:p>
     <w:p>
       <w:pPr>
         <w:pStyle w:val="Heading2"/>
       </w:pPr>
       <w:r>
-        <w:t xml:space="preserve">8.6 2D work left (free Kaggle GPUs)</w:t>
+        <w:t xml:space="preserve">8.7 2D work left</w:t>
       </w:r>
     </w:p>
     <w:tbl>
@@ -14239,7 +15687,7 @@
                 <w:sz w:val="19"/>
                 <w:szCs w:val="19"/>
               </w:rPr>
-              <w:t xml:space="preserve">Total (about one week of Kaggle's free quota)</w:t>
+              <w:t xml:space="preserve">Total (fits one week of Kaggle's free quota, or the cluster)</w:t>
             </w:r>
           </w:p>
         </w:tc>
@@ -14314,7 +15762,7 @@
         <w:pStyle w:val="Heading2"/>
       </w:pPr>
       <w:r>
-        <w:t xml:space="preserve">8.7 Used so far</w:t>
+        <w:t xml:space="preserve">8.8 Used so far</w:t>
       </w:r>
     </w:p>
     <w:p>

</xml_diff>

<commit_message>
Compute docs: anchor 3D training time on our own measurements
DM2's paper gives no training time, so the 1.2 s per update planning figure now rests on our
CPU ratio (NequIP 2.9x our EGNN per atom) applied to our T4 timings: about 1.8-2.4 s on a T4
and 0.9-1.2 s on a V100. Totals are unchanged. Adds the measured training memory and points
to the timing.json each run writes.
</commit_message>
<xml_diff>
--- a/docs/Project_Summary.docx
+++ b/docs/Project_Summary.docx
@@ -1317,7 +1317,7 @@
                 <w:sz w:val="19"/>
                 <w:szCs w:val="19"/>
               </w:rPr>
-              <w:t xml:space="preserve">The full pipeline: data, physics, neural networks, training, generation, the two comparison methods, scoring and figures. 67 automatic tests check it.</w:t>
+              <w:t xml:space="preserve">The full pipeline: data, physics, neural networks, training, generation, the two comparison methods, scoring and figures. 79 automatic tests check it.</w:t>
             </w:r>
           </w:p>
         </w:tc>
@@ -1918,7 +1918,102 @@
                 <w:sz w:val="19"/>
                 <w:szCs w:val="19"/>
               </w:rPr>
-              <w:t xml:space="preserve">Plan only</w:t>
+              <w:t xml:space="preserve">Done</w:t>
+            </w:r>
+          </w:p>
+        </w:tc>
+      </w:tr>
+      <w:tr>
+        <w:tc>
+          <w:tcPr>
+            <w:tcW w:type="dxa" w:w="2600"/>
+            <w:tcBorders>
+              <w:top w:val="single" w:color="BFBFBF" w:sz="4"/>
+              <w:left w:val="single" w:color="BFBFBF" w:sz="4"/>
+              <w:bottom w:val="single" w:color="BFBFBF" w:sz="4"/>
+              <w:right w:val="single" w:color="BFBFBF" w:sz="4"/>
+            </w:tcBorders>
+            <w:tcMar>
+              <w:top w:type="dxa" w:w="60"/>
+              <w:left w:type="dxa" w:w="100"/>
+              <w:bottom w:type="dxa" w:w="60"/>
+              <w:right w:type="dxa" w:w="100"/>
+            </w:tcMar>
+          </w:tcPr>
+          <w:p>
+            <w:pPr>
+              <w:spacing w:after="0" w:line="252"/>
+            </w:pPr>
+            <w:r>
+              <w:rPr>
+                <w:b/>
+                <w:bCs/>
+                <w:sz w:val="19"/>
+                <w:szCs w:val="19"/>
+              </w:rPr>
+              <w:t xml:space="preserve">3D silica scripts</w:t>
+            </w:r>
+          </w:p>
+        </w:tc>
+        <w:tc>
+          <w:tcPr>
+            <w:tcW w:type="dxa" w:w="5160"/>
+            <w:tcBorders>
+              <w:top w:val="single" w:color="BFBFBF" w:sz="4"/>
+              <w:left w:val="single" w:color="BFBFBF" w:sz="4"/>
+              <w:bottom w:val="single" w:color="BFBFBF" w:sz="4"/>
+              <w:right w:val="single" w:color="BFBFBF" w:sz="4"/>
+            </w:tcBorders>
+            <w:tcMar>
+              <w:top w:type="dxa" w:w="60"/>
+              <w:left w:type="dxa" w:w="100"/>
+              <w:bottom w:type="dxa" w:w="60"/>
+              <w:right w:type="dxa" w:w="100"/>
+            </w:tcMar>
+          </w:tcPr>
+          <w:p>
+            <w:pPr>
+              <w:spacing w:after="0" w:line="252"/>
+            </w:pPr>
+            <w:r>
+              <w:rPr>
+                <w:b w:val="false"/>
+                <w:bCs w:val="false"/>
+                <w:sz w:val="19"/>
+                <w:szCs w:val="19"/>
+              </w:rPr>
+              <w:t xml:space="preserve">Training code for 3D silica: DM2's 24 glasses imported and labelled, our simulation input checked against them, the conditional 3D model, training on Kaggle or the PSC cluster (docs/SILICA_QUICKSTART.md).</w:t>
+            </w:r>
+          </w:p>
+        </w:tc>
+        <w:tc>
+          <w:tcPr>
+            <w:tcW w:type="dxa" w:w="1600"/>
+            <w:tcBorders>
+              <w:top w:val="single" w:color="BFBFBF" w:sz="4"/>
+              <w:left w:val="single" w:color="BFBFBF" w:sz="4"/>
+              <w:bottom w:val="single" w:color="BFBFBF" w:sz="4"/>
+              <w:right w:val="single" w:color="BFBFBF" w:sz="4"/>
+            </w:tcBorders>
+            <w:tcMar>
+              <w:top w:type="dxa" w:w="60"/>
+              <w:left w:type="dxa" w:w="100"/>
+              <w:bottom w:type="dxa" w:w="60"/>
+              <w:right w:type="dxa" w:w="100"/>
+            </w:tcMar>
+          </w:tcPr>
+          <w:p>
+            <w:pPr>
+              <w:spacing w:after="0" w:line="252"/>
+            </w:pPr>
+            <w:r>
+              <w:rPr>
+                <w:b w:val="false"/>
+                <w:bCs w:val="false"/>
+                <w:sz w:val="19"/>
+                <w:szCs w:val="19"/>
+              </w:rPr>
+              <w:t xml:space="preserve">Ready to train</w:t>
             </w:r>
           </w:p>
         </w:tc>
@@ -11665,7 +11760,7 @@
                 <w:sz w:val="19"/>
                 <w:szCs w:val="19"/>
               </w:rPr>
-              <w:t xml:space="preserve">1.2 s per update; 45 s per epoch</w:t>
+              <w:t xml:space="preserve">1.2 s per update on a V100; 45 s per epoch</w:t>
             </w:r>
           </w:p>
         </w:tc>
@@ -11696,7 +11791,7 @@
                 <w:sz w:val="19"/>
                 <w:szCs w:val="19"/>
               </w:rPr>
-              <w:t xml:space="preserve">DM2's reported time (30,000 updates on 3,000-atom cells in ~40 h on an A6000), scaled to our cell size</w:t>
+              <w:t xml:space="preserve">Our CPU measurement (NequIP is 2.9 times slower than our EGNN per atom) applied to our T4 times: about 1.8–2.4 s on a T4 and 0.9–1.2 s on a V100. We plan with the slow end. (The DM2 paper does not report its training time.)</w:t>
             </w:r>
           </w:p>
         </w:tc>
@@ -11729,7 +11824,7 @@
                 <w:sz w:val="19"/>
                 <w:szCs w:val="19"/>
               </w:rPr>
-              <w:t xml:space="preserve">Check: NequIP vs our EGNN, per atom</w:t>
+              <w:t xml:space="preserve">3D training memory</w:t>
             </w:r>
           </w:p>
         </w:tc>
@@ -11760,7 +11855,7 @@
                 <w:sz w:val="19"/>
                 <w:szCs w:val="19"/>
               </w:rPr>
-              <w:t xml:space="preserve">2.9 times slower</w:t>
+              <w:t xml:space="preserve">About 0.5 GB per 576-atom glass</w:t>
             </w:r>
           </w:p>
         </w:tc>
@@ -11791,7 +11886,7 @@
                 <w:sz w:val="19"/>
                 <w:szCs w:val="19"/>
               </w:rPr>
-              <w:t xml:space="preserve">Measured on our CPU; it suggests ~0.6 s per update, so 1.2 s is on the safe side</w:t>
+              <w:t xml:space="preserve">Measured on CPU; 16 glasses fit on a free T4 GPU</w:t>
             </w:r>
           </w:p>
         </w:tc>
@@ -16478,7 +16573,7 @@
                 <w:sz w:val="19"/>
                 <w:szCs w:val="19"/>
               </w:rPr>
-              <w:t xml:space="preserve">docs/compute/</w:t>
+              <w:t xml:space="preserve">docs/SILICA_QUICKSTART.md</w:t>
             </w:r>
           </w:p>
         </w:tc>
@@ -16509,7 +16604,7 @@
                 <w:sz w:val="19"/>
                 <w:szCs w:val="19"/>
               </w:rPr>
-              <w:t xml:space="preserve">Compute estimate: tables, budget script and benchmarks</w:t>
+              <w:t xml:space="preserve">How to start 3D silica training (Kaggle and PSC)</w:t>
             </w:r>
           </w:p>
         </w:tc>
@@ -16542,6 +16637,70 @@
                 <w:sz w:val="19"/>
                 <w:szCs w:val="19"/>
               </w:rPr>
+              <w:t xml:space="preserve">docs/compute/</w:t>
+            </w:r>
+          </w:p>
+        </w:tc>
+        <w:tc>
+          <w:tcPr>
+            <w:tcW w:type="dxa" w:w="5560"/>
+            <w:tcBorders>
+              <w:top w:val="single" w:color="BFBFBF" w:sz="4"/>
+              <w:left w:val="single" w:color="BFBFBF" w:sz="4"/>
+              <w:bottom w:val="single" w:color="BFBFBF" w:sz="4"/>
+              <w:right w:val="single" w:color="BFBFBF" w:sz="4"/>
+            </w:tcBorders>
+            <w:tcMar>
+              <w:top w:type="dxa" w:w="60"/>
+              <w:left w:type="dxa" w:w="100"/>
+              <w:bottom w:type="dxa" w:w="60"/>
+              <w:right w:type="dxa" w:w="100"/>
+            </w:tcMar>
+          </w:tcPr>
+          <w:p>
+            <w:pPr>
+              <w:spacing w:after="0" w:line="252"/>
+            </w:pPr>
+            <w:r>
+              <w:rPr>
+                <w:b w:val="false"/>
+                <w:bCs w:val="false"/>
+                <w:sz w:val="19"/>
+                <w:szCs w:val="19"/>
+              </w:rPr>
+              <w:t xml:space="preserve">Compute estimate: tables, budget script and benchmarks</w:t>
+            </w:r>
+          </w:p>
+        </w:tc>
+      </w:tr>
+      <w:tr>
+        <w:tc>
+          <w:tcPr>
+            <w:tcW w:type="dxa" w:w="3800"/>
+            <w:tcBorders>
+              <w:top w:val="single" w:color="BFBFBF" w:sz="4"/>
+              <w:left w:val="single" w:color="BFBFBF" w:sz="4"/>
+              <w:bottom w:val="single" w:color="BFBFBF" w:sz="4"/>
+              <w:right w:val="single" w:color="BFBFBF" w:sz="4"/>
+            </w:tcBorders>
+            <w:tcMar>
+              <w:top w:type="dxa" w:w="60"/>
+              <w:left w:type="dxa" w:w="100"/>
+              <w:bottom w:type="dxa" w:w="60"/>
+              <w:right w:type="dxa" w:w="100"/>
+            </w:tcMar>
+          </w:tcPr>
+          <w:p>
+            <w:pPr>
+              <w:spacing w:after="0" w:line="252"/>
+            </w:pPr>
+            <w:r>
+              <w:rPr>
+                <w:b w:val="false"/>
+                <w:bCs w:val="false"/>
+                <w:sz w:val="19"/>
+                <w:szCs w:val="19"/>
+              </w:rPr>
               <w:t xml:space="preserve">src/glassdiff/, tests/</w:t>
             </w:r>
           </w:p>
@@ -16573,7 +16732,7 @@
                 <w:sz w:val="19"/>
                 <w:szCs w:val="19"/>
               </w:rPr>
-              <w:t xml:space="preserve">The code and its 67 automatic tests</w:t>
+              <w:t xml:space="preserve">The code and its 79 automatic tests</w:t>
             </w:r>
           </w:p>
         </w:tc>

</xml_diff>